<commit_message>
docs: update report docs
</commit_message>
<xml_diff>
--- a/documents/报告/项目简介（完整版）.docx
+++ b/documents/报告/项目简介（完整版）.docx
@@ -257,14 +257,14 @@
       <w:proofErr w:type="gramStart"/>
       <w:r>
         <w:rPr>
-          <w:rFonts w:eastAsia="宋体" w:hint="eastAsia"/>
+          <w:rFonts w:eastAsia="宋体"/>
         </w:rPr>
         <w:t>类案智裁</w:t>
       </w:r>
       <w:proofErr w:type="gramEnd"/>
       <w:r>
         <w:rPr>
-          <w:rFonts w:eastAsia="宋体" w:hint="eastAsia"/>
+          <w:rFonts w:eastAsia="宋体"/>
         </w:rPr>
         <w:t>Agent</w:t>
       </w:r>
@@ -272,19 +272,7 @@
         <w:rPr>
           <w:rFonts w:eastAsia="宋体"/>
         </w:rPr>
-        <w:t>项目聚焦于前述的核心</w:t>
-      </w:r>
-      <w:r>
-        <w:rPr>
-          <w:rFonts w:eastAsia="宋体" w:hint="eastAsia"/>
-        </w:rPr>
-        <w:t>痛点</w:t>
-      </w:r>
-      <w:r>
-        <w:rPr>
-          <w:rFonts w:eastAsia="宋体"/>
-        </w:rPr>
-        <w:t>，以技术赋能法律实务，构建</w:t>
+        <w:t>项目聚焦于前述的核心痛点，以技术赋能法律实务，构建</w:t>
       </w:r>
       <w:r>
         <w:rPr>
@@ -332,19 +320,7 @@
         <w:rPr>
           <w:rFonts w:eastAsia="宋体"/>
         </w:rPr>
-        <w:t>的一体化工作流，通过将</w:t>
-      </w:r>
-      <w:r>
-        <w:rPr>
-          <w:rFonts w:eastAsia="宋体" w:hint="eastAsia"/>
-        </w:rPr>
-        <w:t>人工碎片化流程</w:t>
-      </w:r>
-      <w:r>
-        <w:rPr>
-          <w:rFonts w:eastAsia="宋体"/>
-        </w:rPr>
-        <w:t>转换为可复用、可验证、可持续优化的工程化流程，推动法律服务工作提质增效</w:t>
+        <w:t>的一体化工作流，通过将人工碎片化流程转换为可复用、可验证、可持续优化的工程化流程，推动法律服务工作提质增效</w:t>
       </w:r>
       <w:r>
         <w:rPr>
@@ -864,19 +840,7 @@
         <w:rPr>
           <w:rFonts w:eastAsia="宋体"/>
         </w:rPr>
-        <w:t>的过程</w:t>
-      </w:r>
-      <w:r>
-        <w:rPr>
-          <w:rFonts w:eastAsia="宋体" w:hint="eastAsia"/>
-        </w:rPr>
-        <w:t>已具备直接落地的执行能力</w:t>
-      </w:r>
-      <w:r>
-        <w:rPr>
-          <w:rFonts w:eastAsia="宋体"/>
-        </w:rPr>
-        <w:t>。</w:t>
+        <w:t>的过程已具备直接落地的执行能力。</w:t>
       </w:r>
     </w:p>
     <w:p>
@@ -1029,39 +993,33 @@
       </w:pPr>
       <w:r>
         <w:rPr>
-          <w:rFonts w:eastAsia="宋体" w:hint="eastAsia"/>
+          <w:rFonts w:eastAsia="宋体"/>
         </w:rPr>
         <w:t>在功能层面，系统需要支持自然语言交互检索，使用户无需精准提炼专业术语与检索关键词，即可完成候选案例召回、核心字段智能抽取与法律依据补全，并同步生成</w:t>
       </w:r>
       <w:r>
         <w:rPr>
-          <w:rFonts w:eastAsia="宋体" w:hint="eastAsia"/>
+          <w:rFonts w:eastAsia="宋体"/>
         </w:rPr>
         <w:t>Excel</w:t>
       </w:r>
       <w:r>
         <w:rPr>
-          <w:rFonts w:eastAsia="宋体" w:hint="eastAsia"/>
+          <w:rFonts w:eastAsia="宋体"/>
         </w:rPr>
         <w:t>、</w:t>
       </w:r>
       <w:r>
         <w:rPr>
-          <w:rFonts w:eastAsia="宋体" w:hint="eastAsia"/>
+          <w:rFonts w:eastAsia="宋体"/>
         </w:rPr>
         <w:t>Word</w:t>
       </w:r>
       <w:r>
         <w:rPr>
-          <w:rFonts w:eastAsia="宋体" w:hint="eastAsia"/>
-        </w:rPr>
-        <w:t>双格式标准化成果文件。</w:t>
-      </w:r>
-      <w:r>
-        <w:rPr>
-          <w:rFonts w:eastAsia="宋体"/>
-        </w:rPr>
-        <w:t>其中</w:t>
+          <w:rFonts w:eastAsia="宋体"/>
+        </w:rPr>
+        <w:t>双格式标准化成果文件。其中</w:t>
       </w:r>
       <w:r>
         <w:rPr>
@@ -1244,7 +1202,7 @@
       </w:r>
       <w:r>
         <w:rPr>
-          <w:rFonts w:eastAsia="宋体" w:hint="eastAsia"/>
+          <w:rFonts w:eastAsia="宋体"/>
         </w:rPr>
         <w:t>自然语言检索</w:t>
       </w:r>
@@ -1729,53 +1687,71 @@
       </w:pPr>
       <w:r>
         <w:rPr>
-          <w:rFonts w:eastAsia="宋体" w:hint="eastAsia"/>
+          <w:rFonts w:eastAsia="宋体"/>
         </w:rPr>
         <w:t>系统支持自然语言检索，无需人工反复筛选法律关键词，使用者输入常规表述即可检索相关类案。系统会自动生成多条改写查询，进一步扩大检索召回的覆盖范围，并对召回案例完成去</w:t>
       </w:r>
       <w:proofErr w:type="gramStart"/>
       <w:r>
         <w:rPr>
-          <w:rFonts w:eastAsia="宋体" w:hint="eastAsia"/>
+          <w:rFonts w:eastAsia="宋体"/>
         </w:rPr>
         <w:t>重处理</w:t>
       </w:r>
       <w:proofErr w:type="gramEnd"/>
       <w:r>
         <w:rPr>
-          <w:rFonts w:eastAsia="宋体" w:hint="eastAsia"/>
-        </w:rPr>
-        <w:t>与结构化信息抽取。抽取结果除审理法院、案号、案由、裁判结果等基础字段外，还重点生成两大核心内容：“法院认为”</w:t>
-      </w:r>
-      <w:r>
-        <w:rPr>
-          <w:rFonts w:eastAsia="宋体" w:hint="eastAsia"/>
-        </w:rPr>
-        <w:t xml:space="preserve"> </w:t>
-      </w:r>
-      <w:r>
-        <w:rPr>
-          <w:rFonts w:eastAsia="宋体" w:hint="eastAsia"/>
-        </w:rPr>
-        <w:t>对法院原文说理部分进行逻辑排序与精简，便于快速阅览；“主要原因”</w:t>
-      </w:r>
-      <w:r>
-        <w:rPr>
-          <w:rFonts w:eastAsia="宋体" w:hint="eastAsia"/>
-        </w:rPr>
-        <w:t xml:space="preserve"> </w:t>
-      </w:r>
-      <w:r>
-        <w:rPr>
-          <w:rFonts w:eastAsia="宋体" w:hint="eastAsia"/>
-        </w:rPr>
-        <w:t>提炼本案最直接相关的裁判依据，为后续法律论证与报告撰写提供高效支撑</w:t>
-      </w:r>
-      <w:r>
-        <w:rPr>
-          <w:rFonts w:eastAsia="宋体"/>
-        </w:rPr>
-        <w:t>。</w:t>
+          <w:rFonts w:eastAsia="宋体"/>
+        </w:rPr>
+        <w:t>与结构化信息抽取。抽取结果除审理法院、案号、案由、裁判结果等基础字段外，还重点生成两大核心内容：</w:t>
+      </w:r>
+      <w:r>
+        <w:rPr>
+          <w:rFonts w:eastAsia="宋体"/>
+        </w:rPr>
+        <w:t>“</w:t>
+      </w:r>
+      <w:r>
+        <w:rPr>
+          <w:rFonts w:eastAsia="宋体"/>
+        </w:rPr>
+        <w:t>法院认为</w:t>
+      </w:r>
+      <w:r>
+        <w:rPr>
+          <w:rFonts w:eastAsia="宋体"/>
+        </w:rPr>
+        <w:t xml:space="preserve">” </w:t>
+      </w:r>
+      <w:r>
+        <w:rPr>
+          <w:rFonts w:eastAsia="宋体"/>
+        </w:rPr>
+        <w:t>对法院原文说理部分进行逻辑排序与精简，便于快速阅览；</w:t>
+      </w:r>
+      <w:r>
+        <w:rPr>
+          <w:rFonts w:eastAsia="宋体"/>
+        </w:rPr>
+        <w:t>“</w:t>
+      </w:r>
+      <w:r>
+        <w:rPr>
+          <w:rFonts w:eastAsia="宋体"/>
+        </w:rPr>
+        <w:t>主要原因</w:t>
+      </w:r>
+      <w:r>
+        <w:rPr>
+          <w:rFonts w:eastAsia="宋体"/>
+        </w:rPr>
+        <w:t xml:space="preserve">” </w:t>
+      </w:r>
+      <w:r>
+        <w:rPr>
+          <w:rFonts w:eastAsia="宋体"/>
+        </w:rPr>
+        <w:t>提炼本案最直接相关的裁判依据，为后续法律论证与报告撰写提供高效支撑。</w:t>
       </w:r>
     </w:p>
     <w:p>
@@ -1809,15 +1785,9 @@
       </w:pPr>
       <w:r>
         <w:rPr>
-          <w:rFonts w:eastAsia="宋体" w:hint="eastAsia"/>
-        </w:rPr>
-        <w:t>系统可自动对裁判关键结论进行分类识别与结构化输出，将其划分为权利类、金额类与行为类三大维度：权利类包含是否侵权、是否违约、合同是否有效、是否构成妨害相邻关系等法律定性判断，金额类涵盖判赔、补偿、罚款的具体金额、计算依据及诉请部分支持与否等数值认定内容，行为类则涉及判令拆除、赔礼道歉、恢复原状、禁止建造等具体行为判令。这一设计能够将传统裁判文书中的非结构化文本信息，转化为可比较、可统计的标准化数据，在诉讼策略分析与法律风险评估场景下，有效提升结论的实用性与可操作性</w:t>
-      </w:r>
-      <w:r>
-        <w:rPr>
-          <w:rFonts w:eastAsia="宋体"/>
-        </w:rPr>
-        <w:t>。</w:t>
+          <w:rFonts w:eastAsia="宋体"/>
+        </w:rPr>
+        <w:t>系统可自动对裁判关键结论进行分类识别与结构化输出，将其划分为权利类、金额类与行为类三大维度：权利类包含是否侵权、是否违约、合同是否有效、是否构成妨害相邻关系等法律定性判断，金额类涵盖判赔、补偿、罚款的具体金额、计算依据及诉请部分支持与否等数值认定内容，行为类则涉及判令拆除、赔礼道歉、恢复原状、禁止建造等具体行为判令。这一设计能够将传统裁判文书中的非结构化文本信息，转化为可比较、可统计的标准化数据，在诉讼策略分析与法律风险评估场景下，有效提升结论的实用性与可操作性。</w:t>
       </w:r>
     </w:p>
     <w:p>
@@ -2009,7 +1979,7 @@
       </w:r>
       <w:r>
         <w:rPr>
-          <w:rFonts w:eastAsia="宋体" w:hint="eastAsia"/>
+          <w:rFonts w:eastAsia="宋体"/>
         </w:rPr>
         <w:t>报告。</w:t>
       </w:r>
@@ -2083,61 +2053,49 @@
         <w:rPr>
           <w:rFonts w:eastAsia="宋体"/>
         </w:rPr>
-        <w:t>两个核心环节。</w:t>
-      </w:r>
-      <w:r>
-        <w:rPr>
-          <w:rFonts w:eastAsia="宋体" w:hint="eastAsia"/>
-        </w:rPr>
-        <w:t>成果表达输出上具备成熟的结构化特征：开篇直述核心争议问题，明确法律检索结论；整体采用固定三段式架构，先</w:t>
+        <w:t>两个核心环节。成果表达输出上具备成熟的结构化特征：开篇直述核心争议问题，明确法律检索结论；整体采用固定三段式架构，先</w:t>
       </w:r>
       <w:proofErr w:type="gramStart"/>
       <w:r>
         <w:rPr>
-          <w:rFonts w:eastAsia="宋体" w:hint="eastAsia"/>
+          <w:rFonts w:eastAsia="宋体"/>
         </w:rPr>
         <w:t>概括类案基本</w:t>
       </w:r>
       <w:proofErr w:type="gramEnd"/>
       <w:r>
         <w:rPr>
-          <w:rFonts w:eastAsia="宋体" w:hint="eastAsia"/>
+          <w:rFonts w:eastAsia="宋体"/>
         </w:rPr>
         <w:t>事实，再提炼核心裁判要旨，最后解读关联并得出结论。</w:t>
       </w:r>
       <w:proofErr w:type="gramStart"/>
       <w:r>
         <w:rPr>
-          <w:rFonts w:eastAsia="宋体" w:hint="eastAsia"/>
+          <w:rFonts w:eastAsia="宋体"/>
         </w:rPr>
         <w:t>类案事实</w:t>
       </w:r>
       <w:proofErr w:type="gramEnd"/>
       <w:r>
         <w:rPr>
-          <w:rFonts w:eastAsia="宋体" w:hint="eastAsia"/>
+          <w:rFonts w:eastAsia="宋体"/>
         </w:rPr>
         <w:t>紧扣案例争议焦点，精炼概括且明确相似关联；裁判要旨聚焦核心主张并</w:t>
       </w:r>
       <w:proofErr w:type="gramStart"/>
       <w:r>
         <w:rPr>
-          <w:rFonts w:eastAsia="宋体" w:hint="eastAsia"/>
+          <w:rFonts w:eastAsia="宋体"/>
         </w:rPr>
         <w:t>强化类案适用</w:t>
       </w:r>
       <w:proofErr w:type="gramEnd"/>
       <w:r>
         <w:rPr>
-          <w:rFonts w:eastAsia="宋体" w:hint="eastAsia"/>
-        </w:rPr>
-        <w:t>效力，依据指导意见区分参照层级，形成完整论证闭环。报告格式规范、逻辑严谨，可用于正式法律汇报与案件参考</w:t>
-      </w:r>
-      <w:r>
-        <w:rPr>
-          <w:rFonts w:eastAsia="宋体"/>
-        </w:rPr>
-        <w:t>。</w:t>
+          <w:rFonts w:eastAsia="宋体"/>
+        </w:rPr>
+        <w:t>效力，依据指导意见区分参照层级，形成完整论证闭环。报告格式规范、逻辑严谨，可用于正式法律汇报与案件参考。</w:t>
       </w:r>
     </w:p>
     <w:p>
@@ -2505,25 +2463,7 @@
         <w:rPr>
           <w:rFonts w:eastAsia="宋体"/>
         </w:rPr>
-        <w:t>场景中，可用于纠纷风险识别与决策支持；在法律科技研发与教学研究场景中，</w:t>
-      </w:r>
-      <w:r>
-        <w:rPr>
-          <w:rFonts w:eastAsia="宋体" w:hint="eastAsia"/>
-        </w:rPr>
-        <w:t>还可</w:t>
-      </w:r>
-      <w:r>
-        <w:rPr>
-          <w:rFonts w:eastAsia="宋体"/>
-        </w:rPr>
-        <w:t>作为可复用的数据处理与规则提炼基础设施。不同角色的共同收益在于，把重复性的信息处理工作交给系统，把高价值判断留给专业人员</w:t>
-      </w:r>
-      <w:r>
-        <w:rPr>
-          <w:rFonts w:eastAsia="宋体"/>
-        </w:rPr>
-        <w:t>。</w:t>
+        <w:t>场景中，可用于纠纷风险识别与决策支持；在法律科技研发与教学研究场景中，还可作为可复用的数据处理与规则提炼基础设施。不同角色的共同收益在于，把重复性的信息处理工作交给系统，把高价值判断留给专业人员。</w:t>
       </w:r>
     </w:p>
     <w:p>
@@ -2713,6 +2653,1141 @@
     <w:p>
       <w:pPr>
         <w:pStyle w:val="3"/>
+        <w:rPr>
+          <w:rFonts w:eastAsia="宋体"/>
+        </w:rPr>
+      </w:pPr>
+      <w:r>
+        <w:rPr>
+          <w:rFonts w:eastAsia="宋体"/>
+        </w:rPr>
+        <w:t xml:space="preserve">6.2 </w:t>
+      </w:r>
+      <w:r>
+        <w:rPr>
+          <w:rFonts w:eastAsia="宋体"/>
+        </w:rPr>
+        <w:t>详细</w:t>
+      </w:r>
+      <w:r>
+        <w:rPr>
+          <w:rFonts w:eastAsia="宋体"/>
+        </w:rPr>
+        <w:t>工作流</w:t>
+      </w:r>
+    </w:p>
+    <w:p>
+      <w:pPr>
+        <w:pStyle w:val="4"/>
+        <w:ind w:firstLine="420"/>
+        <w:rPr>
+          <w:rFonts w:eastAsia="宋体"/>
+        </w:rPr>
+      </w:pPr>
+      <w:r>
+        <w:rPr>
+          <w:rFonts w:eastAsia="宋体"/>
+        </w:rPr>
+        <w:t xml:space="preserve">Excel </w:t>
+      </w:r>
+      <w:r>
+        <w:rPr>
+          <w:rFonts w:eastAsia="宋体"/>
+        </w:rPr>
+        <w:t>工作流详解</w:t>
+      </w:r>
+    </w:p>
+    <w:p>
+      <w:pPr>
+        <w:pStyle w:val="a4"/>
+        <w:numPr>
+          <w:ilvl w:val="0"/>
+          <w:numId w:val="3"/>
+        </w:numPr>
+        <w:rPr>
+          <w:rFonts w:eastAsia="宋体"/>
+        </w:rPr>
+      </w:pPr>
+      <w:r>
+        <w:rPr>
+          <w:rFonts w:eastAsia="宋体"/>
+        </w:rPr>
+        <w:t>系统入口调用</w:t>
+      </w:r>
+      <w:r>
+        <w:rPr>
+          <w:rFonts w:eastAsia="宋体"/>
+        </w:rPr>
+        <w:t xml:space="preserve"> </w:t>
+      </w:r>
+      <w:proofErr w:type="spellStart"/>
+      <w:r>
+        <w:rPr>
+          <w:rFonts w:eastAsia="宋体"/>
+        </w:rPr>
+        <w:t>run_excel_workflow</w:t>
+      </w:r>
+      <w:proofErr w:type="spellEnd"/>
+      <w:r>
+        <w:rPr>
+          <w:rFonts w:eastAsia="宋体"/>
+        </w:rPr>
+        <w:t xml:space="preserve"> (query, </w:t>
+      </w:r>
+      <w:proofErr w:type="spellStart"/>
+      <w:r>
+        <w:rPr>
+          <w:rFonts w:eastAsia="宋体"/>
+        </w:rPr>
+        <w:t>target_case_count</w:t>
+      </w:r>
+      <w:proofErr w:type="spellEnd"/>
+      <w:r>
+        <w:rPr>
+          <w:rFonts w:eastAsia="宋体"/>
+        </w:rPr>
+        <w:t>)</w:t>
+      </w:r>
+      <w:r>
+        <w:rPr>
+          <w:rFonts w:eastAsia="宋体"/>
+        </w:rPr>
+        <w:t>，先通过</w:t>
+      </w:r>
+      <w:r>
+        <w:rPr>
+          <w:rFonts w:eastAsia="宋体"/>
+        </w:rPr>
+        <w:t xml:space="preserve"> </w:t>
+      </w:r>
+      <w:proofErr w:type="spellStart"/>
+      <w:r>
+        <w:rPr>
+          <w:rFonts w:eastAsia="宋体"/>
+        </w:rPr>
+        <w:t>load_env</w:t>
+      </w:r>
+      <w:proofErr w:type="spellEnd"/>
+      <w:r>
+        <w:rPr>
+          <w:rFonts w:eastAsia="宋体"/>
+        </w:rPr>
+        <w:t xml:space="preserve"> () </w:t>
+      </w:r>
+      <w:r>
+        <w:rPr>
+          <w:rFonts w:eastAsia="宋体"/>
+        </w:rPr>
+        <w:t>完成运行时环境加载。</w:t>
+      </w:r>
+      <w:r>
+        <w:rPr>
+          <w:rFonts w:eastAsia="宋体"/>
+        </w:rPr>
+        <w:t xml:space="preserve"> </w:t>
+      </w:r>
+    </w:p>
+    <w:p>
+      <w:pPr>
+        <w:pStyle w:val="a4"/>
+        <w:numPr>
+          <w:ilvl w:val="0"/>
+          <w:numId w:val="3"/>
+        </w:numPr>
+        <w:rPr>
+          <w:rFonts w:eastAsia="宋体"/>
+        </w:rPr>
+      </w:pPr>
+      <w:r>
+        <w:rPr>
+          <w:rFonts w:eastAsia="宋体"/>
+        </w:rPr>
+        <w:t>进入</w:t>
+      </w:r>
+      <w:r>
+        <w:rPr>
+          <w:rFonts w:eastAsia="宋体"/>
+        </w:rPr>
+        <w:t xml:space="preserve"> </w:t>
+      </w:r>
+      <w:proofErr w:type="spellStart"/>
+      <w:r>
+        <w:rPr>
+          <w:rFonts w:eastAsia="宋体"/>
+        </w:rPr>
+        <w:t>build_rows</w:t>
+      </w:r>
+      <w:proofErr w:type="spellEnd"/>
+      <w:r>
+        <w:rPr>
+          <w:rFonts w:eastAsia="宋体"/>
+        </w:rPr>
+        <w:t xml:space="preserve"> () </w:t>
+      </w:r>
+      <w:r>
+        <w:rPr>
+          <w:rFonts w:eastAsia="宋体"/>
+        </w:rPr>
+        <w:t>核心处理流程，先基于</w:t>
+      </w:r>
+      <w:r>
+        <w:rPr>
+          <w:rFonts w:eastAsia="宋体"/>
+        </w:rPr>
+        <w:t xml:space="preserve"> excel/</w:t>
+      </w:r>
+      <w:proofErr w:type="spellStart"/>
+      <w:r>
+        <w:rPr>
+          <w:rFonts w:eastAsia="宋体"/>
+        </w:rPr>
+        <w:t>rewrite_queries</w:t>
+      </w:r>
+      <w:proofErr w:type="spellEnd"/>
+      <w:r>
+        <w:rPr>
+          <w:rFonts w:eastAsia="宋体"/>
+        </w:rPr>
+        <w:t xml:space="preserve">_* </w:t>
+      </w:r>
+      <w:r>
+        <w:rPr>
+          <w:rFonts w:eastAsia="宋体"/>
+        </w:rPr>
+        <w:t>提示模板，通过</w:t>
+      </w:r>
+      <w:r>
+        <w:rPr>
+          <w:rFonts w:eastAsia="宋体"/>
+        </w:rPr>
+        <w:t xml:space="preserve"> </w:t>
+      </w:r>
+      <w:proofErr w:type="spellStart"/>
+      <w:r>
+        <w:rPr>
+          <w:rFonts w:eastAsia="宋体"/>
+        </w:rPr>
+        <w:t>rewrite_queries</w:t>
+      </w:r>
+      <w:proofErr w:type="spellEnd"/>
+      <w:r>
+        <w:rPr>
+          <w:rFonts w:eastAsia="宋体"/>
+        </w:rPr>
+        <w:t xml:space="preserve"> () </w:t>
+      </w:r>
+      <w:r>
+        <w:rPr>
+          <w:rFonts w:eastAsia="宋体"/>
+        </w:rPr>
+        <w:t>将原始查询改写为多条法律检索式查询，结果以</w:t>
+      </w:r>
+      <w:r>
+        <w:rPr>
+          <w:rFonts w:eastAsia="宋体"/>
+        </w:rPr>
+        <w:t xml:space="preserve"> </w:t>
+      </w:r>
+      <w:proofErr w:type="spellStart"/>
+      <w:r>
+        <w:rPr>
+          <w:rFonts w:eastAsia="宋体"/>
+        </w:rPr>
+        <w:t>QueryRewriteResult</w:t>
+      </w:r>
+      <w:proofErr w:type="spellEnd"/>
+      <w:r>
+        <w:rPr>
+          <w:rFonts w:eastAsia="宋体"/>
+        </w:rPr>
+        <w:t xml:space="preserve"> </w:t>
+      </w:r>
+      <w:r>
+        <w:rPr>
+          <w:rFonts w:eastAsia="宋体"/>
+        </w:rPr>
+        <w:t>格式规范输出。</w:t>
+      </w:r>
+      <w:r>
+        <w:rPr>
+          <w:rFonts w:eastAsia="宋体"/>
+        </w:rPr>
+        <w:t xml:space="preserve"> </w:t>
+      </w:r>
+    </w:p>
+    <w:p>
+      <w:pPr>
+        <w:pStyle w:val="a4"/>
+        <w:numPr>
+          <w:ilvl w:val="0"/>
+          <w:numId w:val="3"/>
+        </w:numPr>
+        <w:rPr>
+          <w:rFonts w:eastAsia="宋体"/>
+        </w:rPr>
+      </w:pPr>
+      <w:r>
+        <w:rPr>
+          <w:rFonts w:eastAsia="宋体"/>
+        </w:rPr>
+        <w:t>将原始查询与改写后查询组合，通过</w:t>
+      </w:r>
+      <w:r>
+        <w:rPr>
+          <w:rFonts w:eastAsia="宋体"/>
+        </w:rPr>
+        <w:t xml:space="preserve"> </w:t>
+      </w:r>
+      <w:proofErr w:type="spellStart"/>
+      <w:r>
+        <w:rPr>
+          <w:rFonts w:eastAsia="宋体"/>
+        </w:rPr>
+        <w:t>fetch_case_hits</w:t>
+      </w:r>
+      <w:proofErr w:type="spellEnd"/>
+      <w:r>
+        <w:rPr>
+          <w:rFonts w:eastAsia="宋体"/>
+        </w:rPr>
+        <w:t xml:space="preserve"> () </w:t>
+      </w:r>
+      <w:r>
+        <w:rPr>
+          <w:rFonts w:eastAsia="宋体"/>
+        </w:rPr>
+        <w:t>分页检索案例，单页条数由</w:t>
+      </w:r>
+      <w:r>
+        <w:rPr>
+          <w:rFonts w:eastAsia="宋体"/>
+        </w:rPr>
+        <w:t xml:space="preserve"> PAGE_SIZE </w:t>
+      </w:r>
+      <w:r>
+        <w:rPr>
+          <w:rFonts w:eastAsia="宋体"/>
+        </w:rPr>
+        <w:t>控制；利用</w:t>
+      </w:r>
+      <w:r>
+        <w:rPr>
+          <w:rFonts w:eastAsia="宋体"/>
+        </w:rPr>
+        <w:t xml:space="preserve"> </w:t>
+      </w:r>
+      <w:proofErr w:type="spellStart"/>
+      <w:r>
+        <w:rPr>
+          <w:rFonts w:eastAsia="宋体"/>
+        </w:rPr>
+        <w:t>build_case_dedup_key</w:t>
+      </w:r>
+      <w:proofErr w:type="spellEnd"/>
+      <w:r>
+        <w:rPr>
+          <w:rFonts w:eastAsia="宋体"/>
+        </w:rPr>
+        <w:t xml:space="preserve"> () </w:t>
+      </w:r>
+      <w:r>
+        <w:rPr>
+          <w:rFonts w:eastAsia="宋体"/>
+        </w:rPr>
+        <w:t>以案号完成案例去重，达到目标案例数量后停止检索。</w:t>
+      </w:r>
+      <w:r>
+        <w:rPr>
+          <w:rFonts w:eastAsia="宋体"/>
+        </w:rPr>
+        <w:t xml:space="preserve"> </w:t>
+      </w:r>
+    </w:p>
+    <w:p>
+      <w:pPr>
+        <w:pStyle w:val="a4"/>
+        <w:numPr>
+          <w:ilvl w:val="0"/>
+          <w:numId w:val="3"/>
+        </w:numPr>
+        <w:rPr>
+          <w:rFonts w:eastAsia="宋体"/>
+        </w:rPr>
+      </w:pPr>
+      <w:r>
+        <w:rPr>
+          <w:rFonts w:eastAsia="宋体"/>
+        </w:rPr>
+        <w:t>对各案例异步执行</w:t>
+      </w:r>
+      <w:r>
+        <w:rPr>
+          <w:rFonts w:eastAsia="宋体"/>
+        </w:rPr>
+        <w:t xml:space="preserve"> </w:t>
+      </w:r>
+      <w:proofErr w:type="spellStart"/>
+      <w:r>
+        <w:rPr>
+          <w:rFonts w:eastAsia="宋体"/>
+        </w:rPr>
+        <w:t>process_hit</w:t>
+      </w:r>
+      <w:proofErr w:type="spellEnd"/>
+      <w:r>
+        <w:rPr>
+          <w:rFonts w:eastAsia="宋体"/>
+        </w:rPr>
+        <w:t xml:space="preserve"> ()</w:t>
+      </w:r>
+      <w:r>
+        <w:rPr>
+          <w:rFonts w:eastAsia="宋体"/>
+        </w:rPr>
+        <w:t>，通过</w:t>
+      </w:r>
+      <w:r>
+        <w:rPr>
+          <w:rFonts w:eastAsia="宋体"/>
+        </w:rPr>
+        <w:t xml:space="preserve"> </w:t>
+      </w:r>
+      <w:proofErr w:type="spellStart"/>
+      <w:r>
+        <w:rPr>
+          <w:rFonts w:eastAsia="宋体"/>
+        </w:rPr>
+        <w:t>extract_case_fields</w:t>
+      </w:r>
+      <w:proofErr w:type="spellEnd"/>
+      <w:r>
+        <w:rPr>
+          <w:rFonts w:eastAsia="宋体"/>
+        </w:rPr>
+        <w:t xml:space="preserve"> () </w:t>
+      </w:r>
+      <w:r>
+        <w:rPr>
+          <w:rFonts w:eastAsia="宋体"/>
+        </w:rPr>
+        <w:t>搭配对应提示模板抽取结构化字段，结果以</w:t>
+      </w:r>
+      <w:r>
+        <w:rPr>
+          <w:rFonts w:eastAsia="宋体"/>
+        </w:rPr>
+        <w:t xml:space="preserve"> </w:t>
+      </w:r>
+      <w:proofErr w:type="spellStart"/>
+      <w:r>
+        <w:rPr>
+          <w:rFonts w:eastAsia="宋体"/>
+        </w:rPr>
+        <w:t>CaseExtractResult</w:t>
+      </w:r>
+      <w:proofErr w:type="spellEnd"/>
+      <w:r>
+        <w:rPr>
+          <w:rFonts w:eastAsia="宋体"/>
+        </w:rPr>
+        <w:t xml:space="preserve"> </w:t>
+      </w:r>
+      <w:r>
+        <w:rPr>
+          <w:rFonts w:eastAsia="宋体"/>
+        </w:rPr>
+        <w:t>存储；再通过</w:t>
+      </w:r>
+      <w:r>
+        <w:rPr>
+          <w:rFonts w:eastAsia="宋体"/>
+        </w:rPr>
+        <w:t xml:space="preserve"> </w:t>
+      </w:r>
+      <w:proofErr w:type="spellStart"/>
+      <w:r>
+        <w:rPr>
+          <w:rFonts w:eastAsia="宋体"/>
+        </w:rPr>
+        <w:t>rewrite_law_queries</w:t>
+      </w:r>
+      <w:proofErr w:type="spellEnd"/>
+      <w:r>
+        <w:rPr>
+          <w:rFonts w:eastAsia="宋体"/>
+        </w:rPr>
+        <w:t xml:space="preserve"> () </w:t>
+      </w:r>
+      <w:r>
+        <w:rPr>
+          <w:rFonts w:eastAsia="宋体"/>
+        </w:rPr>
+        <w:t>生成法律检索查询并与基础查询合并去重。</w:t>
+      </w:r>
+      <w:r>
+        <w:rPr>
+          <w:rFonts w:eastAsia="宋体"/>
+        </w:rPr>
+        <w:t xml:space="preserve"> </w:t>
+      </w:r>
+    </w:p>
+    <w:p>
+      <w:pPr>
+        <w:pStyle w:val="a4"/>
+        <w:numPr>
+          <w:ilvl w:val="0"/>
+          <w:numId w:val="3"/>
+        </w:numPr>
+        <w:rPr>
+          <w:rFonts w:eastAsia="宋体"/>
+        </w:rPr>
+      </w:pPr>
+      <w:r>
+        <w:rPr>
+          <w:rFonts w:eastAsia="宋体"/>
+        </w:rPr>
+        <w:t>逐条调用</w:t>
+      </w:r>
+      <w:r>
+        <w:rPr>
+          <w:rFonts w:eastAsia="宋体"/>
+        </w:rPr>
+        <w:t xml:space="preserve"> </w:t>
+      </w:r>
+      <w:proofErr w:type="spellStart"/>
+      <w:r>
+        <w:rPr>
+          <w:rFonts w:eastAsia="宋体"/>
+        </w:rPr>
+        <w:t>search_laws</w:t>
+      </w:r>
+      <w:proofErr w:type="spellEnd"/>
+      <w:r>
+        <w:rPr>
+          <w:rFonts w:eastAsia="宋体"/>
+        </w:rPr>
+        <w:t xml:space="preserve"> () </w:t>
+      </w:r>
+      <w:r>
+        <w:rPr>
+          <w:rFonts w:eastAsia="宋体"/>
+        </w:rPr>
+        <w:t>检索法律条文，由</w:t>
+      </w:r>
+      <w:r>
+        <w:rPr>
+          <w:rFonts w:eastAsia="宋体"/>
+        </w:rPr>
+        <w:t xml:space="preserve"> </w:t>
+      </w:r>
+      <w:proofErr w:type="spellStart"/>
+      <w:r>
+        <w:rPr>
+          <w:rFonts w:eastAsia="宋体"/>
+        </w:rPr>
+        <w:t>build_law_basis</w:t>
+      </w:r>
+      <w:proofErr w:type="spellEnd"/>
+      <w:r>
+        <w:rPr>
+          <w:rFonts w:eastAsia="宋体"/>
+        </w:rPr>
+        <w:t xml:space="preserve"> () </w:t>
+      </w:r>
+      <w:r>
+        <w:rPr>
+          <w:rFonts w:eastAsia="宋体"/>
+        </w:rPr>
+        <w:t>整合法律名称与条文内容，无匹配结果时标注</w:t>
+      </w:r>
+      <w:r>
+        <w:rPr>
+          <w:rFonts w:eastAsia="宋体"/>
+        </w:rPr>
+        <w:t xml:space="preserve"> “</w:t>
+      </w:r>
+      <w:r>
+        <w:rPr>
+          <w:rFonts w:eastAsia="宋体"/>
+        </w:rPr>
+        <w:t>未检索到明确法律条文</w:t>
+      </w:r>
+      <w:r>
+        <w:rPr>
+          <w:rFonts w:eastAsia="宋体"/>
+        </w:rPr>
+        <w:t>”</w:t>
+      </w:r>
+      <w:r>
+        <w:rPr>
+          <w:rFonts w:eastAsia="宋体"/>
+        </w:rPr>
+        <w:t>，最终封装为</w:t>
+      </w:r>
+      <w:r>
+        <w:rPr>
+          <w:rFonts w:eastAsia="宋体"/>
+        </w:rPr>
+        <w:t xml:space="preserve"> </w:t>
+      </w:r>
+      <w:proofErr w:type="spellStart"/>
+      <w:r>
+        <w:rPr>
+          <w:rFonts w:eastAsia="宋体"/>
+        </w:rPr>
+        <w:t>MinimalCaseRow</w:t>
+      </w:r>
+      <w:proofErr w:type="spellEnd"/>
+      <w:r>
+        <w:rPr>
+          <w:rFonts w:eastAsia="宋体"/>
+        </w:rPr>
+        <w:t xml:space="preserve"> </w:t>
+      </w:r>
+      <w:r>
+        <w:rPr>
+          <w:rFonts w:eastAsia="宋体"/>
+        </w:rPr>
+        <w:t>统一数据对象。</w:t>
+      </w:r>
+      <w:r>
+        <w:rPr>
+          <w:rFonts w:eastAsia="宋体"/>
+        </w:rPr>
+        <w:t xml:space="preserve"> </w:t>
+      </w:r>
+    </w:p>
+    <w:p>
+      <w:pPr>
+        <w:pStyle w:val="a4"/>
+        <w:numPr>
+          <w:ilvl w:val="0"/>
+          <w:numId w:val="3"/>
+        </w:numPr>
+        <w:rPr>
+          <w:rFonts w:eastAsia="宋体"/>
+          <w:b/>
+          <w:bCs/>
+        </w:rPr>
+      </w:pPr>
+      <w:r>
+        <w:rPr>
+          <w:rFonts w:eastAsia="宋体"/>
+        </w:rPr>
+        <w:t>完成数据处理后，通过</w:t>
+      </w:r>
+      <w:r>
+        <w:rPr>
+          <w:rFonts w:eastAsia="宋体"/>
+        </w:rPr>
+        <w:t xml:space="preserve"> sa</w:t>
+      </w:r>
+      <w:proofErr w:type="spellStart"/>
+      <w:r>
+        <w:rPr>
+          <w:rFonts w:eastAsia="宋体"/>
+        </w:rPr>
+        <w:t>ve_excel</w:t>
+      </w:r>
+      <w:proofErr w:type="spellEnd"/>
+      <w:r>
+        <w:rPr>
+          <w:rFonts w:eastAsia="宋体"/>
+        </w:rPr>
+        <w:t xml:space="preserve"> () </w:t>
+      </w:r>
+      <w:r>
+        <w:rPr>
+          <w:rFonts w:eastAsia="宋体"/>
+        </w:rPr>
+        <w:t>将结果导出至</w:t>
+      </w:r>
+      <w:r>
+        <w:rPr>
+          <w:rFonts w:eastAsia="宋体"/>
+        </w:rPr>
+        <w:t xml:space="preserve"> outputs </w:t>
+      </w:r>
+      <w:r>
+        <w:rPr>
+          <w:rFonts w:eastAsia="宋体"/>
+        </w:rPr>
+        <w:t>目录，文件以时间戳命名，最终输出</w:t>
+      </w:r>
+      <w:r>
+        <w:rPr>
+          <w:rFonts w:eastAsia="宋体"/>
+        </w:rPr>
+        <w:t xml:space="preserve"> Excel </w:t>
+      </w:r>
+      <w:r>
+        <w:rPr>
+          <w:rFonts w:eastAsia="宋体"/>
+        </w:rPr>
+        <w:t>文件路径、结构化行数据列表及命中案例列表。</w:t>
+      </w:r>
+    </w:p>
+    <w:p>
+      <w:pPr>
+        <w:pStyle w:val="4"/>
+        <w:ind w:firstLine="420"/>
+        <w:rPr>
+          <w:rFonts w:eastAsia="宋体"/>
+        </w:rPr>
+      </w:pPr>
+      <w:r>
+        <w:rPr>
+          <w:rFonts w:eastAsia="宋体"/>
+        </w:rPr>
+        <w:t xml:space="preserve">Word </w:t>
+      </w:r>
+      <w:r>
+        <w:rPr>
+          <w:rFonts w:eastAsia="宋体"/>
+        </w:rPr>
+        <w:t>工作流</w:t>
+      </w:r>
+    </w:p>
+    <w:p>
+      <w:pPr>
+        <w:pStyle w:val="a4"/>
+        <w:numPr>
+          <w:ilvl w:val="0"/>
+          <w:numId w:val="4"/>
+        </w:numPr>
+        <w:rPr>
+          <w:rFonts w:eastAsia="宋体"/>
+        </w:rPr>
+      </w:pPr>
+      <w:r>
+        <w:rPr>
+          <w:rFonts w:eastAsia="宋体"/>
+        </w:rPr>
+        <w:t>以</w:t>
+      </w:r>
+      <w:r>
+        <w:rPr>
+          <w:rFonts w:eastAsia="宋体"/>
+        </w:rPr>
+        <w:t xml:space="preserve"> </w:t>
+      </w:r>
+      <w:proofErr w:type="spellStart"/>
+      <w:r>
+        <w:rPr>
+          <w:rFonts w:eastAsia="宋体"/>
+        </w:rPr>
+        <w:t>run_word_workflow</w:t>
+      </w:r>
+      <w:proofErr w:type="spellEnd"/>
+      <w:r>
+        <w:rPr>
+          <w:rFonts w:eastAsia="宋体"/>
+        </w:rPr>
+        <w:t xml:space="preserve"> (query, submitter, </w:t>
+      </w:r>
+      <w:proofErr w:type="spellStart"/>
+      <w:r>
+        <w:rPr>
+          <w:rFonts w:eastAsia="宋体"/>
+        </w:rPr>
+        <w:t>report_title</w:t>
+      </w:r>
+      <w:proofErr w:type="spellEnd"/>
+      <w:r>
+        <w:rPr>
+          <w:rFonts w:eastAsia="宋体"/>
+        </w:rPr>
+        <w:t xml:space="preserve">, </w:t>
+      </w:r>
+      <w:proofErr w:type="spellStart"/>
+      <w:r>
+        <w:rPr>
+          <w:rFonts w:eastAsia="宋体"/>
+        </w:rPr>
+        <w:t>report_date</w:t>
+      </w:r>
+      <w:proofErr w:type="spellEnd"/>
+      <w:r>
+        <w:rPr>
+          <w:rFonts w:eastAsia="宋体"/>
+        </w:rPr>
+        <w:t xml:space="preserve">) </w:t>
+      </w:r>
+      <w:r>
+        <w:rPr>
+          <w:rFonts w:eastAsia="宋体"/>
+        </w:rPr>
+        <w:t>为入口，先执行</w:t>
+      </w:r>
+      <w:r>
+        <w:rPr>
+          <w:rFonts w:eastAsia="宋体"/>
+        </w:rPr>
+        <w:t xml:space="preserve"> </w:t>
+      </w:r>
+      <w:proofErr w:type="spellStart"/>
+      <w:r>
+        <w:rPr>
+          <w:rFonts w:eastAsia="宋体"/>
+        </w:rPr>
+        <w:t>load_env</w:t>
+      </w:r>
+      <w:proofErr w:type="spellEnd"/>
+      <w:r>
+        <w:rPr>
+          <w:rFonts w:eastAsia="宋体"/>
+        </w:rPr>
+        <w:t xml:space="preserve"> () </w:t>
+      </w:r>
+      <w:r>
+        <w:rPr>
+          <w:rFonts w:eastAsia="宋体"/>
+        </w:rPr>
+        <w:t>完成环境初始化。</w:t>
+      </w:r>
+      <w:r>
+        <w:rPr>
+          <w:rFonts w:eastAsia="宋体"/>
+        </w:rPr>
+        <w:t xml:space="preserve"> </w:t>
+      </w:r>
+    </w:p>
+    <w:p>
+      <w:pPr>
+        <w:pStyle w:val="a4"/>
+        <w:numPr>
+          <w:ilvl w:val="0"/>
+          <w:numId w:val="4"/>
+        </w:numPr>
+        <w:rPr>
+          <w:rFonts w:eastAsia="宋体"/>
+        </w:rPr>
+      </w:pPr>
+      <w:r>
+        <w:rPr>
+          <w:rFonts w:eastAsia="宋体"/>
+        </w:rPr>
+        <w:t>复用</w:t>
+      </w:r>
+      <w:r>
+        <w:rPr>
+          <w:rFonts w:eastAsia="宋体"/>
+        </w:rPr>
+        <w:t xml:space="preserve"> Excel </w:t>
+      </w:r>
+      <w:r>
+        <w:rPr>
+          <w:rFonts w:eastAsia="宋体"/>
+        </w:rPr>
+        <w:t>工作流的</w:t>
+      </w:r>
+      <w:r>
+        <w:rPr>
+          <w:rFonts w:eastAsia="宋体"/>
+        </w:rPr>
+        <w:t xml:space="preserve"> </w:t>
+      </w:r>
+      <w:proofErr w:type="spellStart"/>
+      <w:r>
+        <w:rPr>
+          <w:rFonts w:eastAsia="宋体"/>
+        </w:rPr>
+        <w:t>build_rows</w:t>
+      </w:r>
+      <w:proofErr w:type="spellEnd"/>
+      <w:r>
+        <w:rPr>
+          <w:rFonts w:eastAsia="宋体"/>
+        </w:rPr>
+        <w:t xml:space="preserve"> (query) </w:t>
+      </w:r>
+      <w:r>
+        <w:rPr>
+          <w:rFonts w:eastAsia="宋体"/>
+        </w:rPr>
+        <w:t>流程，完成案例检索、去重、字段抽取与法律依据补全，获取结构化行数据与命中案例列表。</w:t>
+      </w:r>
+      <w:r>
+        <w:rPr>
+          <w:rFonts w:eastAsia="宋体"/>
+        </w:rPr>
+        <w:t xml:space="preserve"> </w:t>
+      </w:r>
+    </w:p>
+    <w:p>
+      <w:pPr>
+        <w:pStyle w:val="a4"/>
+        <w:numPr>
+          <w:ilvl w:val="0"/>
+          <w:numId w:val="4"/>
+        </w:numPr>
+        <w:rPr>
+          <w:rFonts w:eastAsia="宋体"/>
+        </w:rPr>
+      </w:pPr>
+      <w:r>
+        <w:rPr>
+          <w:rFonts w:eastAsia="宋体"/>
+        </w:rPr>
+        <w:lastRenderedPageBreak/>
+        <w:t>调用</w:t>
+      </w:r>
+      <w:r>
+        <w:rPr>
+          <w:rFonts w:eastAsia="宋体"/>
+        </w:rPr>
+        <w:t xml:space="preserve"> </w:t>
+      </w:r>
+      <w:proofErr w:type="spellStart"/>
+      <w:r>
+        <w:rPr>
+          <w:rFonts w:eastAsia="宋体"/>
+        </w:rPr>
+        <w:t>generate_word_report_content</w:t>
+      </w:r>
+      <w:proofErr w:type="spellEnd"/>
+      <w:r>
+        <w:rPr>
+          <w:rFonts w:eastAsia="宋体"/>
+        </w:rPr>
+        <w:t xml:space="preserve"> () </w:t>
+      </w:r>
+      <w:r>
+        <w:rPr>
+          <w:rFonts w:eastAsia="宋体"/>
+        </w:rPr>
+        <w:t>生成报告正文，先通过</w:t>
+      </w:r>
+      <w:r>
+        <w:rPr>
+          <w:rFonts w:eastAsia="宋体"/>
+        </w:rPr>
+        <w:t xml:space="preserve"> </w:t>
+      </w:r>
+      <w:proofErr w:type="spellStart"/>
+      <w:r>
+        <w:rPr>
+          <w:rFonts w:eastAsia="宋体"/>
+        </w:rPr>
+        <w:t>build_evidence_baseline</w:t>
+      </w:r>
+      <w:proofErr w:type="spellEnd"/>
+      <w:r>
+        <w:rPr>
+          <w:rFonts w:eastAsia="宋体"/>
+        </w:rPr>
+        <w:t xml:space="preserve"> () </w:t>
+      </w:r>
+      <w:r>
+        <w:rPr>
+          <w:rFonts w:eastAsia="宋体"/>
+        </w:rPr>
+        <w:t>生成样本总数、法院层级、审理程序、法律依据等分布数据，再结合指定提示模板生成正文内容，以</w:t>
+      </w:r>
+      <w:r>
+        <w:rPr>
+          <w:rFonts w:eastAsia="宋体"/>
+        </w:rPr>
+        <w:t xml:space="preserve"> </w:t>
+      </w:r>
+      <w:proofErr w:type="spellStart"/>
+      <w:r>
+        <w:rPr>
+          <w:rFonts w:eastAsia="宋体"/>
+        </w:rPr>
+        <w:t>WordReportContent</w:t>
+      </w:r>
+      <w:proofErr w:type="spellEnd"/>
+      <w:r>
+        <w:rPr>
+          <w:rFonts w:eastAsia="宋体"/>
+        </w:rPr>
+        <w:t xml:space="preserve"> </w:t>
+      </w:r>
+      <w:r>
+        <w:rPr>
+          <w:rFonts w:eastAsia="宋体"/>
+        </w:rPr>
+        <w:t>规范存储。</w:t>
+      </w:r>
+      <w:r>
+        <w:rPr>
+          <w:rFonts w:eastAsia="宋体"/>
+        </w:rPr>
+        <w:t xml:space="preserve"> </w:t>
+      </w:r>
+    </w:p>
+    <w:p>
+      <w:pPr>
+        <w:pStyle w:val="a4"/>
+        <w:numPr>
+          <w:ilvl w:val="0"/>
+          <w:numId w:val="4"/>
+        </w:numPr>
+        <w:rPr>
+          <w:rFonts w:eastAsia="宋体"/>
+        </w:rPr>
+      </w:pPr>
+      <w:r>
+        <w:rPr>
+          <w:rFonts w:eastAsia="宋体"/>
+        </w:rPr>
+        <w:t>执行</w:t>
+      </w:r>
+      <w:r>
+        <w:rPr>
+          <w:rFonts w:eastAsia="宋体"/>
+        </w:rPr>
+        <w:t xml:space="preserve"> </w:t>
+      </w:r>
+      <w:proofErr w:type="spellStart"/>
+      <w:r>
+        <w:rPr>
+          <w:rFonts w:eastAsia="宋体"/>
+        </w:rPr>
+        <w:t>select_attachment_cases</w:t>
+      </w:r>
+      <w:proofErr w:type="spellEnd"/>
+      <w:r>
+        <w:rPr>
+          <w:rFonts w:eastAsia="宋体"/>
+        </w:rPr>
+        <w:t xml:space="preserve"> () </w:t>
+      </w:r>
+      <w:r>
+        <w:rPr>
+          <w:rFonts w:eastAsia="宋体"/>
+        </w:rPr>
+        <w:t>筛选附件案例，先构建</w:t>
+      </w:r>
+      <w:proofErr w:type="gramStart"/>
+      <w:r>
+        <w:rPr>
+          <w:rFonts w:eastAsia="宋体"/>
+        </w:rPr>
+        <w:t>包含案</w:t>
+      </w:r>
+      <w:proofErr w:type="gramEnd"/>
+      <w:r>
+        <w:rPr>
+          <w:rFonts w:eastAsia="宋体"/>
+        </w:rPr>
+        <w:t>号、案由、裁判结果等信息的候选清单，通过对应提示模板确定选中序号，完成合法性校验与去重后确定附件案例列表。</w:t>
+      </w:r>
+      <w:r>
+        <w:rPr>
+          <w:rFonts w:eastAsia="宋体"/>
+        </w:rPr>
+        <w:t xml:space="preserve"> </w:t>
+      </w:r>
+    </w:p>
+    <w:p>
+      <w:pPr>
+        <w:pStyle w:val="a4"/>
+        <w:numPr>
+          <w:ilvl w:val="0"/>
+          <w:numId w:val="4"/>
+        </w:numPr>
+        <w:rPr>
+          <w:rFonts w:eastAsia="宋体"/>
+        </w:rPr>
+      </w:pPr>
+      <w:r>
+        <w:rPr>
+          <w:rFonts w:eastAsia="宋体"/>
+        </w:rPr>
+        <w:t>调用</w:t>
+      </w:r>
+      <w:r>
+        <w:rPr>
+          <w:rFonts w:eastAsia="宋体"/>
+        </w:rPr>
+        <w:t xml:space="preserve"> </w:t>
+      </w:r>
+      <w:proofErr w:type="spellStart"/>
+      <w:r>
+        <w:rPr>
+          <w:rFonts w:eastAsia="宋体"/>
+        </w:rPr>
+        <w:t>save_word</w:t>
+      </w:r>
+      <w:proofErr w:type="spellEnd"/>
+      <w:r>
+        <w:rPr>
+          <w:rFonts w:eastAsia="宋体"/>
+        </w:rPr>
+        <w:t xml:space="preserve"> () </w:t>
+      </w:r>
+      <w:r>
+        <w:rPr>
+          <w:rFonts w:eastAsia="宋体"/>
+        </w:rPr>
+        <w:t>导出文档，依次写入封面、正文、案例表格、法律法规原文、分析内容及附件案例原文并清理</w:t>
+      </w:r>
+      <w:r>
+        <w:rPr>
+          <w:rFonts w:eastAsia="宋体"/>
+        </w:rPr>
+        <w:t xml:space="preserve"> HTML </w:t>
+      </w:r>
+      <w:r>
+        <w:rPr>
+          <w:rFonts w:eastAsia="宋体"/>
+        </w:rPr>
+        <w:t>标记，文件保存至</w:t>
+      </w:r>
+      <w:r>
+        <w:rPr>
+          <w:rFonts w:eastAsia="宋体"/>
+        </w:rPr>
+        <w:t xml:space="preserve"> outputs </w:t>
+      </w:r>
+      <w:r>
+        <w:rPr>
+          <w:rFonts w:eastAsia="宋体"/>
+        </w:rPr>
+        <w:t>目录。</w:t>
+      </w:r>
+      <w:r>
+        <w:rPr>
+          <w:rFonts w:eastAsia="宋体"/>
+        </w:rPr>
+        <w:t xml:space="preserve"> </w:t>
+      </w:r>
+    </w:p>
+    <w:p>
+      <w:pPr>
+        <w:pStyle w:val="a4"/>
+        <w:numPr>
+          <w:ilvl w:val="0"/>
+          <w:numId w:val="4"/>
+        </w:numPr>
+        <w:rPr>
+          <w:rFonts w:eastAsia="宋体"/>
+        </w:rPr>
+      </w:pPr>
+      <w:r>
+        <w:rPr>
+          <w:rFonts w:eastAsia="宋体"/>
+        </w:rPr>
+        <w:t>最终输出</w:t>
+      </w:r>
+      <w:r>
+        <w:rPr>
+          <w:rFonts w:eastAsia="宋体"/>
+        </w:rPr>
+        <w:t xml:space="preserve"> Word </w:t>
+      </w:r>
+      <w:r>
+        <w:rPr>
+          <w:rFonts w:eastAsia="宋体"/>
+        </w:rPr>
+        <w:t>文件路径、结构化行数据列表及附件案例列表。</w:t>
+      </w:r>
+    </w:p>
+    <w:p>
+      <w:pPr>
+        <w:pStyle w:val="3"/>
         <w:spacing w:after="200"/>
         <w:rPr>
           <w:rFonts w:eastAsia="宋体"/>
@@ -2722,7 +3797,19 @@
         <w:rPr>
           <w:rFonts w:eastAsia="宋体"/>
         </w:rPr>
-        <w:t xml:space="preserve">6.2 Prompt </w:t>
+        <w:t>6.</w:t>
+      </w:r>
+      <w:r>
+        <w:rPr>
+          <w:rFonts w:eastAsia="宋体"/>
+        </w:rPr>
+        <w:t>3</w:t>
+      </w:r>
+      <w:r>
+        <w:rPr>
+          <w:rFonts w:eastAsia="宋体"/>
+        </w:rPr>
+        <w:t xml:space="preserve"> Prompt </w:t>
       </w:r>
       <w:r>
         <w:rPr>
@@ -2868,7 +3955,19 @@
         <w:rPr>
           <w:rFonts w:eastAsia="宋体"/>
         </w:rPr>
-        <w:t xml:space="preserve">6.3 </w:t>
+        <w:t>6.</w:t>
+      </w:r>
+      <w:r>
+        <w:rPr>
+          <w:rFonts w:eastAsia="宋体"/>
+        </w:rPr>
+        <w:t>4</w:t>
+      </w:r>
+      <w:r>
+        <w:rPr>
+          <w:rFonts w:eastAsia="宋体"/>
+        </w:rPr>
+        <w:t xml:space="preserve"> </w:t>
       </w:r>
       <w:r>
         <w:rPr>
@@ -3005,7 +4104,19 @@
         <w:rPr>
           <w:rFonts w:eastAsia="宋体"/>
         </w:rPr>
-        <w:t xml:space="preserve">6.4 </w:t>
+        <w:t>6.</w:t>
+      </w:r>
+      <w:r>
+        <w:rPr>
+          <w:rFonts w:eastAsia="宋体"/>
+        </w:rPr>
+        <w:t>5</w:t>
+      </w:r>
+      <w:r>
+        <w:rPr>
+          <w:rFonts w:eastAsia="宋体"/>
+        </w:rPr>
+        <w:t xml:space="preserve"> </w:t>
       </w:r>
       <w:r>
         <w:rPr>
@@ -3242,7 +4353,6 @@
         <w:rPr>
           <w:rFonts w:eastAsia="宋体"/>
         </w:rPr>
-        <w:lastRenderedPageBreak/>
         <w:t>报告完成交付。实践中可先用小样本调试</w:t>
       </w:r>
       <w:r>
@@ -3289,59 +4399,66 @@
       </w:pPr>
       <w:r>
         <w:rPr>
-          <w:rFonts w:eastAsia="宋体" w:hint="eastAsia"/>
+          <w:rFonts w:eastAsia="宋体"/>
         </w:rPr>
         <w:t>本项目立足法律实务数字化转型需求，以智能化技术重构</w:t>
       </w:r>
       <w:proofErr w:type="gramStart"/>
       <w:r>
         <w:rPr>
-          <w:rFonts w:eastAsia="宋体" w:hint="eastAsia"/>
+          <w:rFonts w:eastAsia="宋体"/>
         </w:rPr>
         <w:t>类案检索全</w:t>
       </w:r>
       <w:proofErr w:type="gramEnd"/>
       <w:r>
         <w:rPr>
-          <w:rFonts w:eastAsia="宋体" w:hint="eastAsia"/>
+          <w:rFonts w:eastAsia="宋体"/>
         </w:rPr>
         <w:t>流程。业务层面，</w:t>
       </w:r>
       <w:proofErr w:type="gramStart"/>
       <w:r>
         <w:rPr>
-          <w:rFonts w:eastAsia="宋体" w:hint="eastAsia"/>
+          <w:rFonts w:eastAsia="宋体"/>
         </w:rPr>
         <w:t>类案智裁</w:t>
       </w:r>
       <w:proofErr w:type="gramEnd"/>
       <w:r>
         <w:rPr>
-          <w:rFonts w:eastAsia="宋体" w:hint="eastAsia"/>
+          <w:rFonts w:eastAsia="宋体"/>
         </w:rPr>
         <w:t>Agent</w:t>
       </w:r>
       <w:r>
         <w:rPr>
-          <w:rFonts w:eastAsia="宋体" w:hint="eastAsia"/>
+          <w:rFonts w:eastAsia="宋体"/>
         </w:rPr>
         <w:t>项目能有效降低法律检索与案例分析报告撰写的人力成本，统一团队工作标准与输出质量，大幅压缩从法律问题提出到专业成果落地的全流程周期。技术层面，项目已经形成可扩展的法律</w:t>
       </w:r>
       <w:r>
         <w:rPr>
-          <w:rFonts w:eastAsia="宋体" w:hint="eastAsia"/>
+          <w:rFonts w:eastAsia="宋体"/>
         </w:rPr>
         <w:t xml:space="preserve"> AI </w:t>
       </w:r>
       <w:r>
         <w:rPr>
-          <w:rFonts w:eastAsia="宋体" w:hint="eastAsia"/>
-        </w:rPr>
-        <w:t>工作流范式，实现了检索能力、大语言模型能力与文档生成能力的工程化整合，为适配多案由场景、多文书模板及多角色协同作业筑牢技术基础。后续项目将围绕容错重试、评测体系搭建与自动化测试持续优化迭代，进一步提升系统运行稳定性与长期运维能力，以技术赋能法律实务，实现法律服务工作的提质增效</w:t>
-      </w:r>
-      <w:r>
-        <w:rPr>
-          <w:rFonts w:eastAsia="宋体" w:hint="eastAsia"/>
+          <w:rFonts w:eastAsia="宋体"/>
+        </w:rPr>
+        <w:t>工作流范式，实现了检索能力、大语言模型能力与文档生成能力的工程化整合，为适配多案由场景、多文书模板及多角色协同作业筑牢技术基础。后续项目将围绕容错重试、评测体系搭建与自动化测试持续优</w:t>
+      </w:r>
+      <w:r>
+        <w:rPr>
+          <w:rFonts w:eastAsia="宋体"/>
+        </w:rPr>
+        <w:lastRenderedPageBreak/>
+        <w:t>化迭代，进一步提升系统运行稳定性与长期运维能力，以技术赋能法律实务，实现法律服务工作的提质增效</w:t>
+      </w:r>
+      <w:r>
+        <w:rPr>
+          <w:rFonts w:eastAsia="宋体"/>
         </w:rPr>
         <w:t>。</w:t>
       </w:r>
@@ -3351,6 +4468,2799 @@
         </w:rPr>
         <w:t xml:space="preserve"> </w:t>
       </w:r>
+    </w:p>
+    <w:p>
+      <w:pPr>
+        <w:pStyle w:val="1"/>
+        <w:jc w:val="center"/>
+        <w:rPr>
+          <w:rFonts w:eastAsia="宋体"/>
+        </w:rPr>
+      </w:pPr>
+      <w:r>
+        <w:rPr>
+          <w:rFonts w:eastAsia="宋体"/>
+        </w:rPr>
+        <w:t>附录</w:t>
+      </w:r>
+    </w:p>
+    <w:p>
+      <w:pPr>
+        <w:pStyle w:val="2"/>
+        <w:rPr>
+          <w:rFonts w:eastAsia="宋体"/>
+        </w:rPr>
+      </w:pPr>
+      <w:r>
+        <w:rPr>
+          <w:rFonts w:eastAsia="宋体"/>
+        </w:rPr>
+        <w:t xml:space="preserve">Excel </w:t>
+      </w:r>
+      <w:r>
+        <w:rPr>
+          <w:rFonts w:eastAsia="宋体"/>
+        </w:rPr>
+        <w:t>工作流提示词：</w:t>
+      </w:r>
+    </w:p>
+    <w:p>
+      <w:pPr>
+        <w:ind w:firstLineChars="0" w:firstLine="0"/>
+        <w:rPr>
+          <w:rFonts w:eastAsia="宋体"/>
+        </w:rPr>
+      </w:pPr>
+      <w:proofErr w:type="spellStart"/>
+      <w:r>
+        <w:rPr>
+          <w:rFonts w:eastAsia="宋体"/>
+        </w:rPr>
+        <w:t>extract_case_fields_human</w:t>
+      </w:r>
+      <w:proofErr w:type="spellEnd"/>
+      <w:r>
+        <w:rPr>
+          <w:rFonts w:eastAsia="宋体"/>
+        </w:rPr>
+        <w:t>：</w:t>
+      </w:r>
+      <w:r>
+        <w:rPr>
+          <w:rFonts w:eastAsia="宋体"/>
+        </w:rPr>
+        <w:t>法律要素抽取</w:t>
+      </w:r>
+    </w:p>
+    <w:tbl>
+      <w:tblPr>
+        <w:tblStyle w:val="ad"/>
+        <w:tblW w:w="0" w:type="auto"/>
+        <w:tblLook w:val="04A0" w:firstRow="1" w:lastRow="0" w:firstColumn="1" w:lastColumn="0" w:noHBand="0" w:noVBand="1"/>
+      </w:tblPr>
+      <w:tblGrid>
+        <w:gridCol w:w="9016"/>
+      </w:tblGrid>
+      <w:tr>
+        <w:tc>
+          <w:tcPr>
+            <w:tcW w:w="9016" w:type="dxa"/>
+          </w:tcPr>
+          <w:p>
+            <w:pPr>
+              <w:ind w:firstLineChars="0" w:firstLine="0"/>
+              <w:rPr>
+                <w:rFonts w:eastAsia="宋体"/>
+              </w:rPr>
+            </w:pPr>
+            <w:r>
+              <w:rPr>
+                <w:rFonts w:eastAsia="宋体"/>
+              </w:rPr>
+              <w:t>案件标题：</w:t>
+            </w:r>
+            <w:r>
+              <w:rPr>
+                <w:rFonts w:eastAsia="宋体"/>
+              </w:rPr>
+              <w:t>{</w:t>
+            </w:r>
+            <w:proofErr w:type="spellStart"/>
+            <w:r>
+              <w:rPr>
+                <w:rFonts w:eastAsia="宋体"/>
+              </w:rPr>
+              <w:t>case_title</w:t>
+            </w:r>
+            <w:proofErr w:type="spellEnd"/>
+            <w:r>
+              <w:rPr>
+                <w:rFonts w:eastAsia="宋体"/>
+              </w:rPr>
+              <w:t>}</w:t>
+            </w:r>
+          </w:p>
+          <w:p>
+            <w:pPr>
+              <w:ind w:firstLineChars="0" w:firstLine="0"/>
+              <w:rPr>
+                <w:rFonts w:eastAsia="宋体"/>
+              </w:rPr>
+            </w:pPr>
+            <w:r>
+              <w:rPr>
+                <w:rFonts w:eastAsia="宋体"/>
+              </w:rPr>
+              <w:t>审理法院：</w:t>
+            </w:r>
+            <w:r>
+              <w:rPr>
+                <w:rFonts w:eastAsia="宋体"/>
+              </w:rPr>
+              <w:t>{</w:t>
+            </w:r>
+            <w:proofErr w:type="spellStart"/>
+            <w:r>
+              <w:rPr>
+                <w:rFonts w:eastAsia="宋体"/>
+              </w:rPr>
+              <w:t>court_name</w:t>
+            </w:r>
+            <w:proofErr w:type="spellEnd"/>
+            <w:r>
+              <w:rPr>
+                <w:rFonts w:eastAsia="宋体"/>
+              </w:rPr>
+              <w:t>}</w:t>
+            </w:r>
+          </w:p>
+          <w:p>
+            <w:pPr>
+              <w:ind w:firstLineChars="0" w:firstLine="0"/>
+              <w:rPr>
+                <w:rFonts w:eastAsia="宋体"/>
+              </w:rPr>
+            </w:pPr>
+            <w:r>
+              <w:rPr>
+                <w:rFonts w:eastAsia="宋体"/>
+              </w:rPr>
+              <w:t>案号：</w:t>
+            </w:r>
+            <w:r>
+              <w:rPr>
+                <w:rFonts w:eastAsia="宋体"/>
+              </w:rPr>
+              <w:t>{</w:t>
+            </w:r>
+            <w:proofErr w:type="spellStart"/>
+            <w:r>
+              <w:rPr>
+                <w:rFonts w:eastAsia="宋体"/>
+              </w:rPr>
+              <w:t>case_no</w:t>
+            </w:r>
+            <w:proofErr w:type="spellEnd"/>
+            <w:r>
+              <w:rPr>
+                <w:rFonts w:eastAsia="宋体"/>
+              </w:rPr>
+              <w:t>}</w:t>
+            </w:r>
+          </w:p>
+          <w:p>
+            <w:pPr>
+              <w:ind w:firstLineChars="0" w:firstLine="0"/>
+              <w:rPr>
+                <w:rFonts w:eastAsia="宋体"/>
+              </w:rPr>
+            </w:pPr>
+            <w:r>
+              <w:rPr>
+                <w:rFonts w:eastAsia="宋体"/>
+              </w:rPr>
+              <w:t>案由：</w:t>
+            </w:r>
+            <w:r>
+              <w:rPr>
+                <w:rFonts w:eastAsia="宋体"/>
+              </w:rPr>
+              <w:t>{cause}</w:t>
+            </w:r>
+          </w:p>
+          <w:p>
+            <w:pPr>
+              <w:ind w:firstLineChars="0" w:firstLine="0"/>
+              <w:rPr>
+                <w:rFonts w:eastAsia="宋体"/>
+              </w:rPr>
+            </w:pPr>
+            <w:r>
+              <w:rPr>
+                <w:rFonts w:eastAsia="宋体"/>
+              </w:rPr>
+              <w:t>审理程序（元数据）：</w:t>
+            </w:r>
+            <w:r>
+              <w:rPr>
+                <w:rFonts w:eastAsia="宋体"/>
+              </w:rPr>
+              <w:t>{</w:t>
+            </w:r>
+            <w:proofErr w:type="spellStart"/>
+            <w:r>
+              <w:rPr>
+                <w:rFonts w:eastAsia="宋体"/>
+              </w:rPr>
+              <w:t>level_of_trial</w:t>
+            </w:r>
+            <w:proofErr w:type="spellEnd"/>
+            <w:r>
+              <w:rPr>
+                <w:rFonts w:eastAsia="宋体"/>
+              </w:rPr>
+              <w:t>}</w:t>
+            </w:r>
+          </w:p>
+          <w:p>
+            <w:pPr>
+              <w:ind w:firstLineChars="0" w:firstLine="0"/>
+              <w:rPr>
+                <w:rFonts w:eastAsia="宋体"/>
+              </w:rPr>
+            </w:pPr>
+            <w:r>
+              <w:rPr>
+                <w:rFonts w:eastAsia="宋体"/>
+              </w:rPr>
+              <w:t>案件类型（元数据）：</w:t>
+            </w:r>
+            <w:r>
+              <w:rPr>
+                <w:rFonts w:eastAsia="宋体"/>
+              </w:rPr>
+              <w:t>{</w:t>
+            </w:r>
+            <w:proofErr w:type="spellStart"/>
+            <w:r>
+              <w:rPr>
+                <w:rFonts w:eastAsia="宋体"/>
+              </w:rPr>
+              <w:t>case_type</w:t>
+            </w:r>
+            <w:proofErr w:type="spellEnd"/>
+            <w:r>
+              <w:rPr>
+                <w:rFonts w:eastAsia="宋体"/>
+              </w:rPr>
+              <w:t>}</w:t>
+            </w:r>
+          </w:p>
+          <w:p>
+            <w:pPr>
+              <w:ind w:firstLineChars="0" w:firstLine="0"/>
+              <w:rPr>
+                <w:rFonts w:eastAsia="宋体"/>
+              </w:rPr>
+            </w:pPr>
+          </w:p>
+          <w:p>
+            <w:pPr>
+              <w:ind w:firstLineChars="0" w:firstLine="0"/>
+              <w:rPr>
+                <w:rFonts w:eastAsia="宋体"/>
+              </w:rPr>
+            </w:pPr>
+            <w:r>
+              <w:rPr>
+                <w:rFonts w:eastAsia="宋体"/>
+              </w:rPr>
+              <w:t>裁判文书原文：</w:t>
+            </w:r>
+          </w:p>
+          <w:p>
+            <w:pPr>
+              <w:ind w:firstLineChars="0" w:firstLine="0"/>
+              <w:rPr>
+                <w:rFonts w:eastAsia="宋体"/>
+              </w:rPr>
+            </w:pPr>
+            <w:r>
+              <w:rPr>
+                <w:rFonts w:eastAsia="宋体"/>
+              </w:rPr>
+              <w:t>{</w:t>
+            </w:r>
+            <w:proofErr w:type="spellStart"/>
+            <w:r>
+              <w:rPr>
+                <w:rFonts w:eastAsia="宋体"/>
+              </w:rPr>
+              <w:t>case_content</w:t>
+            </w:r>
+            <w:proofErr w:type="spellEnd"/>
+            <w:r>
+              <w:rPr>
+                <w:rFonts w:eastAsia="宋体"/>
+              </w:rPr>
+              <w:t>}</w:t>
+            </w:r>
+          </w:p>
+          <w:p>
+            <w:pPr>
+              <w:ind w:firstLineChars="0" w:firstLine="0"/>
+              <w:rPr>
+                <w:rFonts w:eastAsia="宋体"/>
+              </w:rPr>
+            </w:pPr>
+          </w:p>
+          <w:p>
+            <w:pPr>
+              <w:ind w:firstLineChars="0" w:firstLine="0"/>
+              <w:rPr>
+                <w:rFonts w:eastAsia="宋体"/>
+              </w:rPr>
+            </w:pPr>
+            <w:r>
+              <w:rPr>
+                <w:rFonts w:eastAsia="宋体"/>
+              </w:rPr>
+              <w:t>请基于以上内容提取结果。</w:t>
+            </w:r>
+          </w:p>
+          <w:p>
+            <w:pPr>
+              <w:ind w:firstLineChars="0" w:firstLine="0"/>
+              <w:rPr>
+                <w:rFonts w:eastAsia="宋体"/>
+              </w:rPr>
+            </w:pPr>
+            <w:r>
+              <w:rPr>
+                <w:rFonts w:eastAsia="宋体"/>
+              </w:rPr>
+              <w:t>结构定义如下：</w:t>
+            </w:r>
+          </w:p>
+          <w:p>
+            <w:pPr>
+              <w:ind w:firstLineChars="0" w:firstLine="0"/>
+              <w:rPr>
+                <w:rFonts w:eastAsia="宋体"/>
+              </w:rPr>
+            </w:pPr>
+            <w:r>
+              <w:rPr>
+                <w:rFonts w:eastAsia="宋体"/>
+              </w:rPr>
+              <w:t>{</w:t>
+            </w:r>
+            <w:proofErr w:type="spellStart"/>
+            <w:r>
+              <w:rPr>
+                <w:rFonts w:eastAsia="宋体"/>
+              </w:rPr>
+              <w:t>schema_text</w:t>
+            </w:r>
+            <w:proofErr w:type="spellEnd"/>
+            <w:r>
+              <w:rPr>
+                <w:rFonts w:eastAsia="宋体"/>
+              </w:rPr>
+              <w:t>}</w:t>
+            </w:r>
+          </w:p>
+        </w:tc>
+      </w:tr>
+    </w:tbl>
+    <w:p>
+      <w:pPr>
+        <w:ind w:firstLineChars="0" w:firstLine="0"/>
+        <w:rPr>
+          <w:rFonts w:eastAsia="宋体"/>
+        </w:rPr>
+      </w:pPr>
+    </w:p>
+    <w:p>
+      <w:pPr>
+        <w:ind w:firstLineChars="0" w:firstLine="0"/>
+        <w:rPr>
+          <w:rFonts w:eastAsia="宋体"/>
+        </w:rPr>
+      </w:pPr>
+      <w:proofErr w:type="spellStart"/>
+      <w:r>
+        <w:rPr>
+          <w:rFonts w:eastAsia="宋体"/>
+        </w:rPr>
+        <w:t>rewrite_law_queries_human</w:t>
+      </w:r>
+      <w:proofErr w:type="spellEnd"/>
+      <w:r>
+        <w:rPr>
+          <w:rFonts w:eastAsia="宋体"/>
+        </w:rPr>
+        <w:t>：法律条文检索</w:t>
+      </w:r>
+    </w:p>
+    <w:tbl>
+      <w:tblPr>
+        <w:tblStyle w:val="ad"/>
+        <w:tblW w:w="0" w:type="auto"/>
+        <w:tblLook w:val="04A0" w:firstRow="1" w:lastRow="0" w:firstColumn="1" w:lastColumn="0" w:noHBand="0" w:noVBand="1"/>
+      </w:tblPr>
+      <w:tblGrid>
+        <w:gridCol w:w="9016"/>
+      </w:tblGrid>
+      <w:tr>
+        <w:tc>
+          <w:tcPr>
+            <w:tcW w:w="9016" w:type="dxa"/>
+          </w:tcPr>
+          <w:p>
+            <w:pPr>
+              <w:ind w:firstLineChars="0" w:firstLine="0"/>
+              <w:rPr>
+                <w:rFonts w:eastAsia="宋体"/>
+              </w:rPr>
+            </w:pPr>
+            <w:r>
+              <w:rPr>
+                <w:rFonts w:eastAsia="宋体"/>
+              </w:rPr>
+              <w:t>请将以下案件信息改写为可用于法条检索的专业查询语句。</w:t>
+            </w:r>
+          </w:p>
+          <w:p>
+            <w:pPr>
+              <w:ind w:firstLineChars="0" w:firstLine="0"/>
+              <w:rPr>
+                <w:rFonts w:eastAsia="宋体"/>
+              </w:rPr>
+            </w:pPr>
+            <w:r>
+              <w:rPr>
+                <w:rFonts w:eastAsia="宋体"/>
+              </w:rPr>
+              <w:t>要求：每条查询是短语，不要解释，不要编号，不要口语化长句。</w:t>
+            </w:r>
+          </w:p>
+          <w:p>
+            <w:pPr>
+              <w:ind w:firstLineChars="0" w:firstLine="0"/>
+              <w:rPr>
+                <w:rFonts w:eastAsia="宋体"/>
+              </w:rPr>
+            </w:pPr>
+            <w:r>
+              <w:rPr>
+                <w:rFonts w:eastAsia="宋体"/>
+              </w:rPr>
+              <w:t>案件标题：</w:t>
+            </w:r>
+            <w:r>
+              <w:rPr>
+                <w:rFonts w:eastAsia="宋体"/>
+              </w:rPr>
+              <w:t>{</w:t>
+            </w:r>
+            <w:proofErr w:type="spellStart"/>
+            <w:r>
+              <w:rPr>
+                <w:rFonts w:eastAsia="宋体"/>
+              </w:rPr>
+              <w:t>case_title</w:t>
+            </w:r>
+            <w:proofErr w:type="spellEnd"/>
+            <w:r>
+              <w:rPr>
+                <w:rFonts w:eastAsia="宋体"/>
+              </w:rPr>
+              <w:t>}</w:t>
+            </w:r>
+          </w:p>
+          <w:p>
+            <w:pPr>
+              <w:ind w:firstLineChars="0" w:firstLine="0"/>
+              <w:rPr>
+                <w:rFonts w:eastAsia="宋体"/>
+              </w:rPr>
+            </w:pPr>
+            <w:r>
+              <w:rPr>
+                <w:rFonts w:eastAsia="宋体"/>
+              </w:rPr>
+              <w:t>案由：</w:t>
+            </w:r>
+            <w:r>
+              <w:rPr>
+                <w:rFonts w:eastAsia="宋体"/>
+              </w:rPr>
+              <w:t>{cause}</w:t>
+            </w:r>
+          </w:p>
+          <w:p>
+            <w:pPr>
+              <w:ind w:firstLineChars="0" w:firstLine="0"/>
+              <w:rPr>
+                <w:rFonts w:eastAsia="宋体"/>
+              </w:rPr>
+            </w:pPr>
+            <w:r>
+              <w:rPr>
+                <w:rFonts w:eastAsia="宋体"/>
+              </w:rPr>
+              <w:t>主要原因：</w:t>
+            </w:r>
+            <w:r>
+              <w:rPr>
+                <w:rFonts w:eastAsia="宋体"/>
+              </w:rPr>
+              <w:t>{</w:t>
+            </w:r>
+            <w:proofErr w:type="spellStart"/>
+            <w:r>
+              <w:rPr>
+                <w:rFonts w:eastAsia="宋体"/>
+              </w:rPr>
+              <w:t>major_reason</w:t>
+            </w:r>
+            <w:proofErr w:type="spellEnd"/>
+            <w:r>
+              <w:rPr>
+                <w:rFonts w:eastAsia="宋体"/>
+              </w:rPr>
+              <w:t>}</w:t>
+            </w:r>
+          </w:p>
+          <w:p>
+            <w:pPr>
+              <w:ind w:firstLineChars="0" w:firstLine="0"/>
+              <w:rPr>
+                <w:rFonts w:eastAsia="宋体"/>
+              </w:rPr>
+            </w:pPr>
+            <w:r>
+              <w:rPr>
+                <w:rFonts w:eastAsia="宋体"/>
+              </w:rPr>
+              <w:t>裁判结果：</w:t>
+            </w:r>
+            <w:r>
+              <w:rPr>
+                <w:rFonts w:eastAsia="宋体"/>
+              </w:rPr>
+              <w:t>{</w:t>
+            </w:r>
+            <w:proofErr w:type="spellStart"/>
+            <w:r>
+              <w:rPr>
+                <w:rFonts w:eastAsia="宋体"/>
+              </w:rPr>
+              <w:t>judgment_result</w:t>
+            </w:r>
+            <w:proofErr w:type="spellEnd"/>
+            <w:r>
+              <w:rPr>
+                <w:rFonts w:eastAsia="宋体"/>
+              </w:rPr>
+              <w:t>}</w:t>
+            </w:r>
+          </w:p>
+          <w:p>
+            <w:pPr>
+              <w:ind w:firstLineChars="0" w:firstLine="0"/>
+              <w:rPr>
+                <w:rFonts w:eastAsia="宋体"/>
+              </w:rPr>
+            </w:pPr>
+            <w:r>
+              <w:rPr>
+                <w:rFonts w:eastAsia="宋体"/>
+              </w:rPr>
+              <w:t>结构定义如下：</w:t>
+            </w:r>
+          </w:p>
+          <w:p>
+            <w:pPr>
+              <w:ind w:firstLineChars="0" w:firstLine="0"/>
+              <w:rPr>
+                <w:rFonts w:eastAsia="宋体"/>
+              </w:rPr>
+            </w:pPr>
+            <w:r>
+              <w:rPr>
+                <w:rFonts w:eastAsia="宋体"/>
+              </w:rPr>
+              <w:t>{</w:t>
+            </w:r>
+            <w:proofErr w:type="spellStart"/>
+            <w:r>
+              <w:rPr>
+                <w:rFonts w:eastAsia="宋体"/>
+              </w:rPr>
+              <w:t>schema_text</w:t>
+            </w:r>
+            <w:proofErr w:type="spellEnd"/>
+            <w:r>
+              <w:rPr>
+                <w:rFonts w:eastAsia="宋体"/>
+              </w:rPr>
+              <w:t>}</w:t>
+            </w:r>
+          </w:p>
+        </w:tc>
+      </w:tr>
+    </w:tbl>
+    <w:p>
+      <w:pPr>
+        <w:ind w:firstLineChars="0" w:firstLine="0"/>
+        <w:rPr>
+          <w:rFonts w:eastAsia="宋体"/>
+        </w:rPr>
+      </w:pPr>
+    </w:p>
+    <w:p>
+      <w:pPr>
+        <w:ind w:firstLineChars="0" w:firstLine="0"/>
+        <w:rPr>
+          <w:rFonts w:eastAsia="宋体"/>
+        </w:rPr>
+      </w:pPr>
+      <w:proofErr w:type="spellStart"/>
+      <w:r>
+        <w:rPr>
+          <w:rFonts w:eastAsia="宋体"/>
+        </w:rPr>
+        <w:t>rewrite_queries_human</w:t>
+      </w:r>
+      <w:proofErr w:type="spellEnd"/>
+      <w:r>
+        <w:rPr>
+          <w:rFonts w:eastAsia="宋体"/>
+        </w:rPr>
+        <w:t>：</w:t>
+      </w:r>
+      <w:r>
+        <w:rPr>
+          <w:rFonts w:eastAsia="宋体"/>
+        </w:rPr>
+        <w:t>法律检索改写</w:t>
+      </w:r>
+    </w:p>
+    <w:tbl>
+      <w:tblPr>
+        <w:tblStyle w:val="ad"/>
+        <w:tblW w:w="0" w:type="auto"/>
+        <w:tblLook w:val="04A0" w:firstRow="1" w:lastRow="0" w:firstColumn="1" w:lastColumn="0" w:noHBand="0" w:noVBand="1"/>
+      </w:tblPr>
+      <w:tblGrid>
+        <w:gridCol w:w="9016"/>
+      </w:tblGrid>
+      <w:tr>
+        <w:tc>
+          <w:tcPr>
+            <w:tcW w:w="9016" w:type="dxa"/>
+          </w:tcPr>
+          <w:p>
+            <w:pPr>
+              <w:ind w:firstLineChars="0" w:firstLine="0"/>
+              <w:rPr>
+                <w:rFonts w:eastAsia="宋体"/>
+              </w:rPr>
+            </w:pPr>
+            <w:r>
+              <w:rPr>
+                <w:rFonts w:eastAsia="宋体"/>
+              </w:rPr>
+              <w:t>用户原始查询：</w:t>
+            </w:r>
+            <w:r>
+              <w:rPr>
+                <w:rFonts w:eastAsia="宋体"/>
+              </w:rPr>
+              <w:t>{query}</w:t>
+            </w:r>
+          </w:p>
+          <w:p>
+            <w:pPr>
+              <w:ind w:firstLineChars="0" w:firstLine="0"/>
+              <w:rPr>
+                <w:rFonts w:eastAsia="宋体"/>
+              </w:rPr>
+            </w:pPr>
+            <w:r>
+              <w:rPr>
+                <w:rFonts w:eastAsia="宋体"/>
+              </w:rPr>
+              <w:t>请输出</w:t>
+            </w:r>
+            <w:r>
+              <w:rPr>
+                <w:rFonts w:eastAsia="宋体"/>
+              </w:rPr>
+              <w:t>{</w:t>
+            </w:r>
+            <w:proofErr w:type="spellStart"/>
+            <w:r>
+              <w:rPr>
+                <w:rFonts w:eastAsia="宋体"/>
+              </w:rPr>
+              <w:t>rewrite_query_count</w:t>
+            </w:r>
+            <w:proofErr w:type="spellEnd"/>
+            <w:r>
+              <w:rPr>
+                <w:rFonts w:eastAsia="宋体"/>
+              </w:rPr>
+              <w:t>}</w:t>
+            </w:r>
+            <w:r>
+              <w:rPr>
+                <w:rFonts w:eastAsia="宋体"/>
+              </w:rPr>
+              <w:t>条不同的专业法律检索语句。</w:t>
+            </w:r>
+          </w:p>
+          <w:p>
+            <w:pPr>
+              <w:ind w:firstLineChars="0" w:firstLine="0"/>
+              <w:rPr>
+                <w:rFonts w:eastAsia="宋体"/>
+              </w:rPr>
+            </w:pPr>
+            <w:r>
+              <w:rPr>
+                <w:rFonts w:eastAsia="宋体"/>
+              </w:rPr>
+              <w:t>要求：不加解释、不加编号、不使用原句。</w:t>
+            </w:r>
+          </w:p>
+          <w:p>
+            <w:pPr>
+              <w:ind w:firstLineChars="0" w:firstLine="0"/>
+              <w:rPr>
+                <w:rFonts w:eastAsia="宋体"/>
+              </w:rPr>
+            </w:pPr>
+            <w:r>
+              <w:rPr>
+                <w:rFonts w:eastAsia="宋体"/>
+              </w:rPr>
+              <w:t>结构定义如下：</w:t>
+            </w:r>
+          </w:p>
+          <w:p>
+            <w:pPr>
+              <w:ind w:firstLineChars="0" w:firstLine="0"/>
+              <w:rPr>
+                <w:rFonts w:eastAsia="宋体"/>
+              </w:rPr>
+            </w:pPr>
+            <w:r>
+              <w:rPr>
+                <w:rFonts w:eastAsia="宋体"/>
+              </w:rPr>
+              <w:t>{</w:t>
+            </w:r>
+            <w:proofErr w:type="spellStart"/>
+            <w:r>
+              <w:rPr>
+                <w:rFonts w:eastAsia="宋体"/>
+              </w:rPr>
+              <w:t>schema_text</w:t>
+            </w:r>
+            <w:proofErr w:type="spellEnd"/>
+            <w:r>
+              <w:rPr>
+                <w:rFonts w:eastAsia="宋体"/>
+              </w:rPr>
+              <w:t>}</w:t>
+            </w:r>
+          </w:p>
+        </w:tc>
+      </w:tr>
+    </w:tbl>
+    <w:p>
+      <w:pPr>
+        <w:ind w:firstLineChars="0" w:firstLine="0"/>
+        <w:rPr>
+          <w:rFonts w:eastAsia="宋体"/>
+        </w:rPr>
+      </w:pPr>
+    </w:p>
+    <w:p>
+      <w:pPr>
+        <w:pStyle w:val="2"/>
+        <w:rPr>
+          <w:rFonts w:eastAsia="宋体"/>
+        </w:rPr>
+      </w:pPr>
+      <w:r>
+        <w:rPr>
+          <w:rFonts w:eastAsia="宋体"/>
+        </w:rPr>
+        <w:t>Word</w:t>
+      </w:r>
+      <w:r>
+        <w:rPr>
+          <w:rFonts w:eastAsia="宋体"/>
+        </w:rPr>
+        <w:t>工作流提示词：</w:t>
+      </w:r>
+    </w:p>
+    <w:p>
+      <w:pPr>
+        <w:ind w:firstLineChars="0" w:firstLine="0"/>
+        <w:rPr>
+          <w:rFonts w:eastAsia="宋体"/>
+        </w:rPr>
+      </w:pPr>
+      <w:r>
+        <w:rPr>
+          <w:rFonts w:eastAsia="宋体"/>
+        </w:rPr>
+        <w:t xml:space="preserve"> </w:t>
+      </w:r>
+      <w:proofErr w:type="spellStart"/>
+      <w:r>
+        <w:rPr>
+          <w:rFonts w:eastAsia="宋体"/>
+        </w:rPr>
+        <w:t>writer_system</w:t>
+      </w:r>
+      <w:proofErr w:type="spellEnd"/>
+      <w:r>
+        <w:rPr>
+          <w:rFonts w:eastAsia="宋体"/>
+        </w:rPr>
+        <w:t>：系统撰写提示词</w:t>
+      </w:r>
+    </w:p>
+    <w:tbl>
+      <w:tblPr>
+        <w:tblStyle w:val="ad"/>
+        <w:tblW w:w="0" w:type="auto"/>
+        <w:tblLook w:val="04A0" w:firstRow="1" w:lastRow="0" w:firstColumn="1" w:lastColumn="0" w:noHBand="0" w:noVBand="1"/>
+      </w:tblPr>
+      <w:tblGrid>
+        <w:gridCol w:w="9016"/>
+      </w:tblGrid>
+      <w:tr>
+        <w:tc>
+          <w:tcPr>
+            <w:tcW w:w="9016" w:type="dxa"/>
+          </w:tcPr>
+          <w:p>
+            <w:pPr>
+              <w:ind w:firstLineChars="0" w:firstLine="0"/>
+              <w:rPr>
+                <w:rFonts w:eastAsia="宋体"/>
+              </w:rPr>
+            </w:pPr>
+            <w:r>
+              <w:rPr>
+                <w:rFonts w:eastAsia="宋体"/>
+              </w:rPr>
+              <w:t>你是法律文书写作助手，具有丰富的法律知识与法律常识，现</w:t>
+            </w:r>
+            <w:proofErr w:type="gramStart"/>
+            <w:r>
+              <w:rPr>
+                <w:rFonts w:eastAsia="宋体"/>
+              </w:rPr>
+              <w:t>负责类案检索</w:t>
+            </w:r>
+            <w:proofErr w:type="gramEnd"/>
+            <w:r>
+              <w:rPr>
+                <w:rFonts w:eastAsia="宋体"/>
+              </w:rPr>
+              <w:t>报告的编写任务</w:t>
+            </w:r>
+          </w:p>
+          <w:p>
+            <w:pPr>
+              <w:ind w:firstLineChars="0" w:firstLine="0"/>
+              <w:rPr>
+                <w:rFonts w:eastAsia="宋体"/>
+              </w:rPr>
+            </w:pPr>
+          </w:p>
+          <w:p>
+            <w:pPr>
+              <w:ind w:firstLineChars="0" w:firstLine="0"/>
+              <w:rPr>
+                <w:rFonts w:eastAsia="宋体"/>
+              </w:rPr>
+            </w:pPr>
+            <w:r>
+              <w:rPr>
+                <w:rFonts w:eastAsia="宋体"/>
+              </w:rPr>
+              <w:t>请根据以下撰写要点</w:t>
+            </w:r>
+            <w:proofErr w:type="gramStart"/>
+            <w:r>
+              <w:rPr>
+                <w:rFonts w:eastAsia="宋体"/>
+              </w:rPr>
+              <w:t>输出类案检索</w:t>
+            </w:r>
+            <w:proofErr w:type="gramEnd"/>
+            <w:r>
+              <w:rPr>
+                <w:rFonts w:eastAsia="宋体"/>
+              </w:rPr>
+              <w:t>报告正文内容：</w:t>
+            </w:r>
+          </w:p>
+          <w:p>
+            <w:pPr>
+              <w:ind w:firstLineChars="0" w:firstLine="0"/>
+              <w:rPr>
+                <w:rFonts w:eastAsia="宋体"/>
+              </w:rPr>
+            </w:pPr>
+            <w:r>
+              <w:rPr>
+                <w:rFonts w:eastAsia="宋体"/>
+              </w:rPr>
+              <w:t>【要点一】开篇必须旗帜鲜明亮明观点：待论证核心争议问题</w:t>
+            </w:r>
+            <w:r>
+              <w:rPr>
+                <w:rFonts w:eastAsia="宋体"/>
+              </w:rPr>
+              <w:t xml:space="preserve"> + </w:t>
+            </w:r>
+            <w:r>
+              <w:rPr>
+                <w:rFonts w:eastAsia="宋体"/>
+              </w:rPr>
+              <w:t>本方明确法律结</w:t>
+            </w:r>
+            <w:r>
+              <w:rPr>
+                <w:rFonts w:eastAsia="宋体"/>
+              </w:rPr>
+              <w:lastRenderedPageBreak/>
+              <w:t>论。</w:t>
+            </w:r>
+          </w:p>
+          <w:p>
+            <w:pPr>
+              <w:ind w:firstLineChars="0" w:firstLine="0"/>
+              <w:rPr>
+                <w:rFonts w:eastAsia="宋体"/>
+              </w:rPr>
+            </w:pPr>
+            <w:r>
+              <w:rPr>
+                <w:rFonts w:eastAsia="宋体"/>
+              </w:rPr>
+              <w:t>【要点二】采用固定两段式：第一部分</w:t>
+            </w:r>
+            <w:proofErr w:type="gramStart"/>
+            <w:r>
+              <w:rPr>
+                <w:rFonts w:eastAsia="宋体"/>
+              </w:rPr>
+              <w:t>概括类案基本</w:t>
+            </w:r>
+            <w:proofErr w:type="gramEnd"/>
+            <w:r>
+              <w:rPr>
+                <w:rFonts w:eastAsia="宋体"/>
+              </w:rPr>
+              <w:t>事实；第二部分总结</w:t>
+            </w:r>
+            <w:proofErr w:type="gramStart"/>
+            <w:r>
+              <w:rPr>
+                <w:rFonts w:eastAsia="宋体"/>
+              </w:rPr>
+              <w:t>类案核心裁判</w:t>
+            </w:r>
+            <w:proofErr w:type="gramEnd"/>
+            <w:r>
+              <w:rPr>
+                <w:rFonts w:eastAsia="宋体"/>
+              </w:rPr>
+              <w:t>要旨。</w:t>
+            </w:r>
+          </w:p>
+          <w:p>
+            <w:pPr>
+              <w:ind w:firstLineChars="0" w:firstLine="0"/>
+              <w:rPr>
+                <w:rFonts w:eastAsia="宋体"/>
+              </w:rPr>
+            </w:pPr>
+            <w:proofErr w:type="gramStart"/>
+            <w:r>
+              <w:rPr>
+                <w:rFonts w:eastAsia="宋体"/>
+              </w:rPr>
+              <w:t>【要点三】类案事实</w:t>
+            </w:r>
+            <w:proofErr w:type="gramEnd"/>
+            <w:r>
+              <w:rPr>
+                <w:rFonts w:eastAsia="宋体"/>
+              </w:rPr>
+              <w:t>梳理详略得当并高度绑定本案。</w:t>
+            </w:r>
+          </w:p>
+          <w:p>
+            <w:pPr>
+              <w:ind w:firstLineChars="0" w:firstLine="0"/>
+              <w:rPr>
+                <w:rFonts w:eastAsia="宋体"/>
+              </w:rPr>
+            </w:pPr>
+            <w:r>
+              <w:rPr>
+                <w:rFonts w:eastAsia="宋体"/>
+              </w:rPr>
+              <w:t>【要点四】裁判要旨必须高度聚焦本方核心主张。</w:t>
+            </w:r>
+          </w:p>
+          <w:p>
+            <w:pPr>
+              <w:ind w:firstLineChars="0" w:firstLine="0"/>
+              <w:rPr>
+                <w:rFonts w:eastAsia="宋体"/>
+              </w:rPr>
+            </w:pPr>
+            <w:r>
+              <w:rPr>
+                <w:rFonts w:eastAsia="宋体"/>
+              </w:rPr>
+              <w:t>【要点五】结论清晰有力，并区分应当</w:t>
+            </w:r>
+            <w:proofErr w:type="gramStart"/>
+            <w:r>
+              <w:rPr>
+                <w:rFonts w:eastAsia="宋体"/>
+              </w:rPr>
+              <w:t>参照类案与</w:t>
+            </w:r>
+            <w:proofErr w:type="gramEnd"/>
+            <w:r>
+              <w:rPr>
+                <w:rFonts w:eastAsia="宋体"/>
+              </w:rPr>
+              <w:t>可以参考类案。</w:t>
+            </w:r>
+          </w:p>
+          <w:p>
+            <w:pPr>
+              <w:ind w:firstLineChars="0" w:firstLine="0"/>
+              <w:rPr>
+                <w:rFonts w:eastAsia="宋体"/>
+              </w:rPr>
+            </w:pPr>
+          </w:p>
+          <w:p>
+            <w:pPr>
+              <w:ind w:firstLineChars="0" w:firstLine="0"/>
+              <w:rPr>
+                <w:rFonts w:eastAsia="宋体"/>
+              </w:rPr>
+            </w:pPr>
+            <w:r>
+              <w:rPr>
+                <w:rFonts w:eastAsia="宋体"/>
+              </w:rPr>
+              <w:t>硬性约束：</w:t>
+            </w:r>
+          </w:p>
+          <w:p>
+            <w:pPr>
+              <w:ind w:firstLineChars="0" w:firstLine="0"/>
+              <w:rPr>
+                <w:rFonts w:eastAsia="宋体"/>
+              </w:rPr>
+            </w:pPr>
+            <w:r>
+              <w:rPr>
+                <w:rFonts w:eastAsia="宋体"/>
+              </w:rPr>
+              <w:t xml:space="preserve">1) </w:t>
+            </w:r>
+            <w:r>
+              <w:rPr>
+                <w:rFonts w:eastAsia="宋体"/>
+              </w:rPr>
+              <w:t>避免使用绝对化表述，谨慎使用</w:t>
+            </w:r>
+            <w:r>
+              <w:rPr>
+                <w:rFonts w:eastAsia="宋体"/>
+              </w:rPr>
+              <w:t>“</w:t>
+            </w:r>
+            <w:r>
+              <w:rPr>
+                <w:rFonts w:eastAsia="宋体"/>
+              </w:rPr>
+              <w:t>全部、绝对、完全、最优、唯一、所有</w:t>
+            </w:r>
+            <w:r>
+              <w:rPr>
+                <w:rFonts w:eastAsia="宋体"/>
+              </w:rPr>
+              <w:t>”</w:t>
+            </w:r>
+            <w:r>
+              <w:rPr>
+                <w:rFonts w:eastAsia="宋体"/>
+              </w:rPr>
+              <w:t>等绝对化词语。</w:t>
+            </w:r>
+          </w:p>
+          <w:p>
+            <w:pPr>
+              <w:ind w:firstLineChars="0" w:firstLine="0"/>
+              <w:rPr>
+                <w:rFonts w:eastAsia="宋体"/>
+              </w:rPr>
+            </w:pPr>
+            <w:r>
+              <w:rPr>
+                <w:rFonts w:eastAsia="宋体"/>
+              </w:rPr>
+              <w:t xml:space="preserve">2) </w:t>
+            </w:r>
+            <w:r>
+              <w:rPr>
+                <w:rFonts w:eastAsia="宋体"/>
+              </w:rPr>
+              <w:t>文风庄重、书面化，用词严谨，可直接提交合议庭。</w:t>
+            </w:r>
+          </w:p>
+          <w:p>
+            <w:pPr>
+              <w:ind w:firstLineChars="0" w:firstLine="0"/>
+              <w:rPr>
+                <w:rFonts w:eastAsia="宋体"/>
+              </w:rPr>
+            </w:pPr>
+            <w:r>
+              <w:rPr>
+                <w:rFonts w:eastAsia="宋体"/>
+              </w:rPr>
+              <w:t xml:space="preserve">3) </w:t>
+            </w:r>
+            <w:r>
+              <w:rPr>
+                <w:rFonts w:eastAsia="宋体"/>
+              </w:rPr>
+              <w:t>严禁输出空段落或仅含空白字符的段落。</w:t>
+            </w:r>
+          </w:p>
+          <w:p>
+            <w:pPr>
+              <w:ind w:firstLineChars="0" w:firstLine="0"/>
+              <w:rPr>
+                <w:rFonts w:eastAsia="宋体"/>
+              </w:rPr>
+            </w:pPr>
+            <w:r>
+              <w:rPr>
+                <w:rFonts w:eastAsia="宋体"/>
+              </w:rPr>
+              <w:t xml:space="preserve">4) </w:t>
+            </w:r>
+            <w:r>
+              <w:rPr>
+                <w:rFonts w:eastAsia="宋体"/>
+              </w:rPr>
+              <w:t>涉及观点判断时，优先引用</w:t>
+            </w:r>
+            <w:r>
+              <w:rPr>
+                <w:rFonts w:eastAsia="宋体"/>
+              </w:rPr>
+              <w:t>“</w:t>
+            </w:r>
+            <w:r>
+              <w:rPr>
+                <w:rFonts w:eastAsia="宋体"/>
+              </w:rPr>
+              <w:t>证据基准数据</w:t>
+            </w:r>
+            <w:r>
+              <w:rPr>
+                <w:rFonts w:eastAsia="宋体"/>
+              </w:rPr>
+              <w:t>”</w:t>
+            </w:r>
+            <w:r>
+              <w:rPr>
+                <w:rFonts w:eastAsia="宋体"/>
+              </w:rPr>
+              <w:t>中的样本总数、数量或占比作为支撑。</w:t>
+            </w:r>
+          </w:p>
+          <w:p>
+            <w:pPr>
+              <w:ind w:firstLineChars="0" w:firstLine="0"/>
+              <w:rPr>
+                <w:rFonts w:eastAsia="宋体"/>
+              </w:rPr>
+            </w:pPr>
+            <w:r>
+              <w:rPr>
+                <w:rFonts w:eastAsia="宋体"/>
+              </w:rPr>
+              <w:t xml:space="preserve">5) </w:t>
+            </w:r>
+            <w:r>
+              <w:rPr>
+                <w:rFonts w:eastAsia="宋体"/>
+              </w:rPr>
+              <w:t>对法学观点需明确给出支持该观点的裁判数量（可写</w:t>
+            </w:r>
+            <w:r>
+              <w:rPr>
+                <w:rFonts w:eastAsia="宋体"/>
+              </w:rPr>
+              <w:t>“X</w:t>
+            </w:r>
+            <w:r>
+              <w:rPr>
+                <w:rFonts w:eastAsia="宋体"/>
+              </w:rPr>
+              <w:t>件</w:t>
+            </w:r>
+            <w:r>
+              <w:rPr>
+                <w:rFonts w:eastAsia="宋体"/>
+              </w:rPr>
+              <w:t>/</w:t>
+            </w:r>
+            <w:r>
+              <w:rPr>
+                <w:rFonts w:eastAsia="宋体"/>
+              </w:rPr>
+              <w:t>占比</w:t>
+            </w:r>
+            <w:r>
+              <w:rPr>
+                <w:rFonts w:eastAsia="宋体"/>
+              </w:rPr>
+              <w:t>Y%”</w:t>
+            </w:r>
+            <w:r>
+              <w:rPr>
+                <w:rFonts w:eastAsia="宋体"/>
+              </w:rPr>
+              <w:t>）。</w:t>
+            </w:r>
+          </w:p>
+          <w:p>
+            <w:pPr>
+              <w:ind w:firstLineChars="0" w:firstLine="0"/>
+              <w:rPr>
+                <w:rFonts w:eastAsia="宋体"/>
+              </w:rPr>
+            </w:pPr>
+            <w:r>
+              <w:rPr>
+                <w:rFonts w:eastAsia="宋体"/>
+              </w:rPr>
+              <w:t xml:space="preserve">6) </w:t>
+            </w:r>
+            <w:r>
+              <w:rPr>
+                <w:rFonts w:eastAsia="宋体"/>
+              </w:rPr>
+              <w:t>若证据基准数据中无直接支撑，必须使用</w:t>
+            </w:r>
+            <w:r>
+              <w:rPr>
+                <w:rFonts w:eastAsia="宋体"/>
+              </w:rPr>
+              <w:t>“</w:t>
+            </w:r>
+            <w:r>
+              <w:rPr>
+                <w:rFonts w:eastAsia="宋体"/>
+              </w:rPr>
+              <w:t>基于当前检索样本</w:t>
+            </w:r>
+            <w:r>
+              <w:rPr>
+                <w:rFonts w:eastAsia="宋体"/>
+              </w:rPr>
+              <w:t>”</w:t>
+            </w:r>
+            <w:r>
+              <w:rPr>
+                <w:rFonts w:eastAsia="宋体"/>
+              </w:rPr>
+              <w:t>作谨慎表述。</w:t>
+            </w:r>
+          </w:p>
+          <w:p>
+            <w:pPr>
+              <w:ind w:firstLineChars="0" w:firstLine="0"/>
+              <w:rPr>
+                <w:rFonts w:eastAsia="宋体"/>
+              </w:rPr>
+            </w:pPr>
+          </w:p>
+          <w:p>
+            <w:pPr>
+              <w:ind w:firstLineChars="0" w:firstLine="0"/>
+              <w:rPr>
+                <w:rFonts w:eastAsia="宋体"/>
+              </w:rPr>
+            </w:pPr>
+            <w:r>
+              <w:rPr>
+                <w:rFonts w:eastAsia="宋体"/>
+              </w:rPr>
+              <w:t>输出必须严格符合给定结构定义。</w:t>
+            </w:r>
+          </w:p>
+        </w:tc>
+      </w:tr>
+    </w:tbl>
+    <w:p>
+      <w:pPr>
+        <w:ind w:firstLineChars="0" w:firstLine="0"/>
+        <w:rPr>
+          <w:rFonts w:eastAsia="宋体"/>
+        </w:rPr>
+      </w:pPr>
+    </w:p>
+    <w:p>
+      <w:pPr>
+        <w:ind w:firstLineChars="0" w:firstLine="0"/>
+        <w:rPr>
+          <w:rFonts w:eastAsia="宋体"/>
+        </w:rPr>
+      </w:pPr>
+      <w:proofErr w:type="spellStart"/>
+      <w:r>
+        <w:rPr>
+          <w:rFonts w:eastAsia="宋体"/>
+        </w:rPr>
+        <w:t>report_human</w:t>
+      </w:r>
+      <w:proofErr w:type="spellEnd"/>
+      <w:r>
+        <w:rPr>
+          <w:rFonts w:eastAsia="宋体"/>
+        </w:rPr>
+        <w:t>：报告各部分细节说明</w:t>
+      </w:r>
+    </w:p>
+    <w:tbl>
+      <w:tblPr>
+        <w:tblStyle w:val="ad"/>
+        <w:tblW w:w="0" w:type="auto"/>
+        <w:tblLook w:val="04A0" w:firstRow="1" w:lastRow="0" w:firstColumn="1" w:lastColumn="0" w:noHBand="0" w:noVBand="1"/>
+      </w:tblPr>
+      <w:tblGrid>
+        <w:gridCol w:w="9016"/>
+      </w:tblGrid>
+      <w:tr>
+        <w:tc>
+          <w:tcPr>
+            <w:tcW w:w="9016" w:type="dxa"/>
+          </w:tcPr>
+          <w:p>
+            <w:pPr>
+              <w:ind w:firstLineChars="0" w:firstLine="0"/>
+              <w:rPr>
+                <w:rFonts w:eastAsia="宋体"/>
+              </w:rPr>
+            </w:pPr>
+            <w:r>
+              <w:rPr>
+                <w:rFonts w:eastAsia="宋体"/>
+              </w:rPr>
+              <w:t>下面是各个部分的详细要求：</w:t>
+            </w:r>
+          </w:p>
+          <w:p>
+            <w:pPr>
+              <w:ind w:firstLineChars="0" w:firstLine="0"/>
+              <w:rPr>
+                <w:rFonts w:eastAsia="宋体"/>
+              </w:rPr>
+            </w:pPr>
+            <w:r>
+              <w:rPr>
+                <w:rFonts w:eastAsia="宋体"/>
+              </w:rPr>
+              <w:t>【案件简述】</w:t>
+            </w:r>
+          </w:p>
+          <w:p>
+            <w:pPr>
+              <w:ind w:firstLineChars="0" w:firstLine="0"/>
+              <w:rPr>
+                <w:rFonts w:eastAsia="宋体"/>
+              </w:rPr>
+            </w:pPr>
+            <w:r>
+              <w:rPr>
+                <w:rFonts w:eastAsia="宋体"/>
+              </w:rPr>
+              <w:t xml:space="preserve">    1.</w:t>
+            </w:r>
+            <w:r>
+              <w:rPr>
+                <w:rFonts w:eastAsia="宋体"/>
+              </w:rPr>
+              <w:t>正文须说明待决案件核心事实背景，并明确为何需要将待决案件</w:t>
+            </w:r>
+            <w:proofErr w:type="gramStart"/>
+            <w:r>
+              <w:rPr>
+                <w:rFonts w:eastAsia="宋体"/>
+              </w:rPr>
+              <w:t>与类案进行</w:t>
+            </w:r>
+            <w:proofErr w:type="gramEnd"/>
+            <w:r>
+              <w:rPr>
+                <w:rFonts w:eastAsia="宋体"/>
+              </w:rPr>
+              <w:t>比较。</w:t>
+            </w:r>
+          </w:p>
+          <w:p>
+            <w:pPr>
+              <w:ind w:firstLineChars="0" w:firstLine="0"/>
+              <w:rPr>
+                <w:rFonts w:eastAsia="宋体"/>
+              </w:rPr>
+            </w:pPr>
+            <w:r>
+              <w:rPr>
+                <w:rFonts w:eastAsia="宋体"/>
+              </w:rPr>
+              <w:t>【检索方法】</w:t>
+            </w:r>
+          </w:p>
+          <w:p>
+            <w:pPr>
+              <w:ind w:firstLineChars="0" w:firstLine="0"/>
+              <w:rPr>
+                <w:rFonts w:eastAsia="宋体"/>
+              </w:rPr>
+            </w:pPr>
+            <w:r>
+              <w:rPr>
+                <w:rFonts w:eastAsia="宋体"/>
+              </w:rPr>
+              <w:t xml:space="preserve">    1.</w:t>
+            </w:r>
+            <w:r>
+              <w:rPr>
+                <w:rFonts w:eastAsia="宋体"/>
+              </w:rPr>
+              <w:t>按照数据如实填写、明确检索方法：包括检索平台、检索关键词、检索法院、检索时间。不得伪造。</w:t>
+            </w:r>
+          </w:p>
+          <w:p>
+            <w:pPr>
+              <w:ind w:firstLineChars="0" w:firstLine="0"/>
+              <w:rPr>
+                <w:rFonts w:eastAsia="宋体"/>
+              </w:rPr>
+            </w:pPr>
+            <w:r>
+              <w:rPr>
+                <w:rFonts w:eastAsia="宋体"/>
+              </w:rPr>
+              <w:t xml:space="preserve">    2.</w:t>
+            </w:r>
+            <w:r>
+              <w:rPr>
+                <w:rFonts w:eastAsia="宋体"/>
+              </w:rPr>
+              <w:t>如果数据存在按审级和地域分类统计检索结果，需要完成相应情况的说明。</w:t>
+            </w:r>
+          </w:p>
+          <w:p>
+            <w:pPr>
+              <w:ind w:firstLineChars="0" w:firstLine="0"/>
+              <w:rPr>
+                <w:rFonts w:eastAsia="宋体"/>
+              </w:rPr>
+            </w:pPr>
+            <w:r>
+              <w:rPr>
+                <w:rFonts w:eastAsia="宋体"/>
+              </w:rPr>
+              <w:t>【本案关联性】</w:t>
+            </w:r>
+          </w:p>
+          <w:p>
+            <w:pPr>
+              <w:ind w:firstLineChars="0" w:firstLine="0"/>
+              <w:rPr>
+                <w:rFonts w:eastAsia="宋体"/>
+              </w:rPr>
+            </w:pPr>
+            <w:r>
+              <w:rPr>
+                <w:rFonts w:eastAsia="宋体"/>
+              </w:rPr>
+              <w:t xml:space="preserve">    1.</w:t>
+            </w:r>
+            <w:r>
+              <w:rPr>
+                <w:rFonts w:eastAsia="宋体"/>
+              </w:rPr>
+              <w:t>本案关联性</w:t>
+            </w:r>
+            <w:proofErr w:type="gramStart"/>
+            <w:r>
+              <w:rPr>
+                <w:rFonts w:eastAsia="宋体"/>
+              </w:rPr>
+              <w:t>段必须</w:t>
+            </w:r>
+            <w:proofErr w:type="gramEnd"/>
+            <w:r>
+              <w:rPr>
+                <w:rFonts w:eastAsia="宋体"/>
+              </w:rPr>
+              <w:t>明确</w:t>
+            </w:r>
+            <w:proofErr w:type="gramStart"/>
+            <w:r>
+              <w:rPr>
+                <w:rFonts w:eastAsia="宋体"/>
+              </w:rPr>
+              <w:t>指出类案与</w:t>
+            </w:r>
+            <w:proofErr w:type="gramEnd"/>
+            <w:r>
+              <w:rPr>
+                <w:rFonts w:eastAsia="宋体"/>
+              </w:rPr>
+              <w:t>本案直接相关的法律争点</w:t>
+            </w:r>
+          </w:p>
+          <w:p>
+            <w:pPr>
+              <w:ind w:firstLineChars="0" w:firstLine="0"/>
+              <w:rPr>
+                <w:rFonts w:eastAsia="宋体"/>
+              </w:rPr>
+            </w:pPr>
+            <w:r>
+              <w:rPr>
+                <w:rFonts w:eastAsia="宋体"/>
+              </w:rPr>
+              <w:t xml:space="preserve">    2.</w:t>
+            </w:r>
+            <w:r>
+              <w:rPr>
+                <w:rFonts w:eastAsia="宋体"/>
+              </w:rPr>
+              <w:t>详细</w:t>
+            </w:r>
+            <w:proofErr w:type="gramStart"/>
+            <w:r>
+              <w:rPr>
+                <w:rFonts w:eastAsia="宋体"/>
+              </w:rPr>
+              <w:t>描述类案与</w:t>
+            </w:r>
+            <w:proofErr w:type="gramEnd"/>
+            <w:r>
+              <w:rPr>
+                <w:rFonts w:eastAsia="宋体"/>
+              </w:rPr>
+              <w:t>本案的关联性</w:t>
+            </w:r>
+          </w:p>
+          <w:p>
+            <w:pPr>
+              <w:ind w:firstLineChars="0" w:firstLine="0"/>
+              <w:rPr>
+                <w:rFonts w:eastAsia="宋体"/>
+              </w:rPr>
+            </w:pPr>
+            <w:r>
+              <w:rPr>
+                <w:rFonts w:eastAsia="宋体"/>
+              </w:rPr>
+              <w:t>【相关法律法规原文】</w:t>
+            </w:r>
+          </w:p>
+          <w:p>
+            <w:pPr>
+              <w:ind w:firstLineChars="0" w:firstLine="0"/>
+              <w:rPr>
+                <w:rFonts w:eastAsia="宋体"/>
+              </w:rPr>
+            </w:pPr>
+            <w:r>
+              <w:rPr>
+                <w:rFonts w:eastAsia="宋体"/>
+              </w:rPr>
+              <w:t xml:space="preserve">    1.</w:t>
+            </w:r>
+            <w:r>
+              <w:rPr>
+                <w:rFonts w:eastAsia="宋体"/>
+              </w:rPr>
+              <w:t>每条法规需包含</w:t>
+            </w:r>
+            <w:r>
+              <w:rPr>
+                <w:rFonts w:eastAsia="宋体"/>
+              </w:rPr>
+              <w:t>“</w:t>
+            </w:r>
+            <w:r>
+              <w:rPr>
+                <w:rFonts w:eastAsia="宋体"/>
+              </w:rPr>
+              <w:t>法规名称与条款</w:t>
+            </w:r>
+            <w:r>
+              <w:rPr>
+                <w:rFonts w:eastAsia="宋体"/>
+              </w:rPr>
+              <w:t>”“</w:t>
+            </w:r>
+            <w:r>
+              <w:rPr>
+                <w:rFonts w:eastAsia="宋体"/>
+              </w:rPr>
+              <w:t>条文原文</w:t>
+            </w:r>
+            <w:r>
+              <w:rPr>
+                <w:rFonts w:eastAsia="宋体"/>
+              </w:rPr>
+              <w:t>”</w:t>
+            </w:r>
+            <w:r>
+              <w:rPr>
+                <w:rFonts w:eastAsia="宋体"/>
+              </w:rPr>
+              <w:t>。</w:t>
+            </w:r>
+          </w:p>
+          <w:p>
+            <w:pPr>
+              <w:ind w:firstLineChars="0" w:firstLine="0"/>
+              <w:rPr>
+                <w:rFonts w:eastAsia="宋体"/>
+              </w:rPr>
+            </w:pPr>
+            <w:r>
+              <w:rPr>
+                <w:rFonts w:eastAsia="宋体"/>
+              </w:rPr>
+              <w:t xml:space="preserve">    2.</w:t>
+            </w:r>
+            <w:r>
+              <w:rPr>
+                <w:rFonts w:eastAsia="宋体"/>
+              </w:rPr>
+              <w:t>条文要点列表按规范法律文书写法输出，内容与本案争议直接相关。</w:t>
+            </w:r>
+          </w:p>
+          <w:p>
+            <w:pPr>
+              <w:ind w:firstLineChars="0" w:firstLine="0"/>
+              <w:rPr>
+                <w:rFonts w:eastAsia="宋体"/>
+              </w:rPr>
+            </w:pPr>
+            <w:r>
+              <w:rPr>
+                <w:rFonts w:eastAsia="宋体"/>
+              </w:rPr>
+              <w:t>【类案检索结果分析】</w:t>
+            </w:r>
+          </w:p>
+          <w:p>
+            <w:pPr>
+              <w:ind w:firstLineChars="0" w:firstLine="0"/>
+              <w:rPr>
+                <w:rFonts w:eastAsia="宋体"/>
+              </w:rPr>
+            </w:pPr>
+            <w:r>
+              <w:rPr>
+                <w:rFonts w:eastAsia="宋体"/>
+              </w:rPr>
+              <w:t xml:space="preserve">    1.</w:t>
+            </w:r>
+            <w:r>
+              <w:rPr>
+                <w:rFonts w:eastAsia="宋体"/>
+              </w:rPr>
+              <w:t>列表必须恰好</w:t>
+            </w:r>
+            <w:r>
+              <w:rPr>
+                <w:rFonts w:eastAsia="宋体"/>
+              </w:rPr>
+              <w:t xml:space="preserve"> 5 </w:t>
+            </w:r>
+            <w:proofErr w:type="gramStart"/>
+            <w:r>
+              <w:rPr>
+                <w:rFonts w:eastAsia="宋体"/>
+              </w:rPr>
+              <w:t>个</w:t>
+            </w:r>
+            <w:proofErr w:type="gramEnd"/>
+            <w:r>
+              <w:rPr>
+                <w:rFonts w:eastAsia="宋体"/>
+              </w:rPr>
+              <w:t>。</w:t>
+            </w:r>
+          </w:p>
+          <w:p>
+            <w:pPr>
+              <w:ind w:firstLineChars="0" w:firstLine="0"/>
+              <w:rPr>
+                <w:rFonts w:eastAsia="宋体"/>
+              </w:rPr>
+            </w:pPr>
+            <w:r>
+              <w:rPr>
+                <w:rFonts w:eastAsia="宋体"/>
+              </w:rPr>
+              <w:t xml:space="preserve">    2.</w:t>
+            </w:r>
+            <w:r>
+              <w:rPr>
+                <w:rFonts w:eastAsia="宋体"/>
+              </w:rPr>
+              <w:t>第一个内容：回应前文检索方式，说明检索路径、检索范围或检索口径如何支撑本节结论</w:t>
+            </w:r>
+          </w:p>
+          <w:p>
+            <w:pPr>
+              <w:ind w:firstLineChars="0" w:firstLine="0"/>
+              <w:rPr>
+                <w:rFonts w:eastAsia="宋体"/>
+              </w:rPr>
+            </w:pPr>
+            <w:r>
+              <w:rPr>
+                <w:rFonts w:eastAsia="宋体"/>
+              </w:rPr>
+              <w:t xml:space="preserve">    2.</w:t>
+            </w:r>
+            <w:r>
+              <w:rPr>
+                <w:rFonts w:eastAsia="宋体"/>
+              </w:rPr>
+              <w:t>后</w:t>
+            </w:r>
+            <w:r>
+              <w:rPr>
+                <w:rFonts w:eastAsia="宋体"/>
+              </w:rPr>
+              <w:t>4</w:t>
+            </w:r>
+            <w:r>
+              <w:rPr>
+                <w:rFonts w:eastAsia="宋体"/>
+              </w:rPr>
+              <w:t>条的表达逻辑是：法律原文</w:t>
+            </w:r>
+            <w:r>
+              <w:rPr>
+                <w:rFonts w:eastAsia="宋体"/>
+              </w:rPr>
+              <w:t>—</w:t>
+            </w:r>
+            <w:r>
+              <w:rPr>
+                <w:rFonts w:eastAsia="宋体"/>
+              </w:rPr>
+              <w:t>事实认定</w:t>
+            </w:r>
+            <w:r>
+              <w:rPr>
+                <w:rFonts w:eastAsia="宋体"/>
+              </w:rPr>
+              <w:t>—</w:t>
+            </w:r>
+            <w:proofErr w:type="gramStart"/>
+            <w:r>
+              <w:rPr>
+                <w:rFonts w:eastAsia="宋体"/>
+              </w:rPr>
+              <w:t>类案规则</w:t>
+            </w:r>
+            <w:proofErr w:type="gramEnd"/>
+            <w:r>
+              <w:rPr>
+                <w:rFonts w:eastAsia="宋体"/>
+              </w:rPr>
+              <w:t>—</w:t>
+            </w:r>
+            <w:r>
+              <w:rPr>
+                <w:rFonts w:eastAsia="宋体"/>
+              </w:rPr>
+              <w:t>结论</w:t>
+            </w:r>
+          </w:p>
+          <w:p>
+            <w:pPr>
+              <w:ind w:firstLineChars="0" w:firstLine="0"/>
+              <w:rPr>
+                <w:rFonts w:eastAsia="宋体"/>
+              </w:rPr>
+            </w:pPr>
+            <w:r>
+              <w:rPr>
+                <w:rFonts w:eastAsia="宋体"/>
+              </w:rPr>
+              <w:t xml:space="preserve">    3.</w:t>
+            </w:r>
+            <w:r>
+              <w:rPr>
+                <w:rFonts w:eastAsia="宋体"/>
+              </w:rPr>
+              <w:t>第二个内容：针对性地对本案的适用的法律条文进行解读，说明为何采纳我方主张条文而不采纳对方援引条文（若对方援引条文存在）</w:t>
+            </w:r>
+          </w:p>
+          <w:p>
+            <w:pPr>
+              <w:ind w:firstLineChars="0" w:firstLine="0"/>
+              <w:rPr>
+                <w:rFonts w:eastAsia="宋体"/>
+              </w:rPr>
+            </w:pPr>
+            <w:r>
+              <w:rPr>
+                <w:rFonts w:eastAsia="宋体"/>
+              </w:rPr>
+              <w:t xml:space="preserve">    2.</w:t>
+            </w:r>
+            <w:r>
+              <w:rPr>
+                <w:rFonts w:eastAsia="宋体"/>
+              </w:rPr>
+              <w:t>第三个内容：事实论证需要说明为什么对方事实认定错误</w:t>
+            </w:r>
+          </w:p>
+          <w:p>
+            <w:pPr>
+              <w:ind w:firstLineChars="0" w:firstLine="0"/>
+              <w:rPr>
+                <w:rFonts w:eastAsia="宋体"/>
+              </w:rPr>
+            </w:pPr>
+            <w:r>
+              <w:rPr>
+                <w:rFonts w:eastAsia="宋体"/>
+              </w:rPr>
+              <w:t xml:space="preserve">    3.</w:t>
+            </w:r>
+            <w:r>
+              <w:rPr>
+                <w:rFonts w:eastAsia="宋体"/>
+              </w:rPr>
+              <w:t>第四个内容：</w:t>
+            </w:r>
+            <w:proofErr w:type="gramStart"/>
+            <w:r>
+              <w:rPr>
+                <w:rFonts w:eastAsia="宋体"/>
+              </w:rPr>
+              <w:t>类案裁判需体现</w:t>
+            </w:r>
+            <w:proofErr w:type="gramEnd"/>
+            <w:r>
+              <w:rPr>
+                <w:rFonts w:eastAsia="宋体"/>
+              </w:rPr>
+              <w:t>证明我方观点并反对辩方观点，可适当</w:t>
+            </w:r>
+            <w:proofErr w:type="gramStart"/>
+            <w:r>
+              <w:rPr>
+                <w:rFonts w:eastAsia="宋体"/>
+              </w:rPr>
+              <w:t>引用类案裁判</w:t>
+            </w:r>
+            <w:proofErr w:type="gramEnd"/>
+            <w:r>
+              <w:rPr>
+                <w:rFonts w:eastAsia="宋体"/>
+              </w:rPr>
+              <w:t>规则来支持我方论点</w:t>
+            </w:r>
+          </w:p>
+          <w:p>
+            <w:pPr>
+              <w:ind w:firstLineChars="0" w:firstLine="0"/>
+              <w:rPr>
+                <w:rFonts w:eastAsia="宋体"/>
+              </w:rPr>
+            </w:pPr>
+            <w:r>
+              <w:rPr>
+                <w:rFonts w:eastAsia="宋体"/>
+              </w:rPr>
+              <w:t xml:space="preserve">    4.</w:t>
+            </w:r>
+            <w:r>
+              <w:rPr>
+                <w:rFonts w:eastAsia="宋体"/>
+              </w:rPr>
+              <w:t>第五个内容：定结论</w:t>
+            </w:r>
+          </w:p>
+          <w:p>
+            <w:pPr>
+              <w:ind w:firstLineChars="0" w:firstLine="0"/>
+              <w:rPr>
+                <w:rFonts w:eastAsia="宋体"/>
+              </w:rPr>
+            </w:pPr>
+          </w:p>
+          <w:p>
+            <w:pPr>
+              <w:ind w:firstLineChars="0" w:firstLine="0"/>
+              <w:rPr>
+                <w:rFonts w:eastAsia="宋体"/>
+              </w:rPr>
+            </w:pPr>
+            <w:r>
+              <w:rPr>
+                <w:rFonts w:eastAsia="宋体"/>
+              </w:rPr>
+              <w:t>本案检索主题：</w:t>
+            </w:r>
+          </w:p>
+          <w:p>
+            <w:pPr>
+              <w:ind w:firstLineChars="0" w:firstLine="0"/>
+              <w:rPr>
+                <w:rFonts w:eastAsia="宋体"/>
+              </w:rPr>
+            </w:pPr>
+            <w:r>
+              <w:rPr>
+                <w:rFonts w:eastAsia="宋体"/>
+              </w:rPr>
+              <w:t>{query}</w:t>
+            </w:r>
+          </w:p>
+          <w:p>
+            <w:pPr>
+              <w:ind w:firstLineChars="0" w:firstLine="0"/>
+              <w:rPr>
+                <w:rFonts w:eastAsia="宋体"/>
+              </w:rPr>
+            </w:pPr>
+          </w:p>
+          <w:p>
+            <w:pPr>
+              <w:ind w:firstLineChars="0" w:firstLine="0"/>
+              <w:rPr>
+                <w:rFonts w:eastAsia="宋体"/>
+              </w:rPr>
+            </w:pPr>
+            <w:r>
+              <w:rPr>
+                <w:rFonts w:eastAsia="宋体"/>
+              </w:rPr>
+              <w:t>证据基准数据（必须优先引用）：</w:t>
+            </w:r>
+          </w:p>
+          <w:p>
+            <w:pPr>
+              <w:ind w:firstLineChars="0" w:firstLine="0"/>
+              <w:rPr>
+                <w:rFonts w:eastAsia="宋体"/>
+              </w:rPr>
+            </w:pPr>
+            <w:r>
+              <w:rPr>
+                <w:rFonts w:eastAsia="宋体"/>
+              </w:rPr>
+              <w:t>{</w:t>
+            </w:r>
+            <w:proofErr w:type="spellStart"/>
+            <w:r>
+              <w:rPr>
+                <w:rFonts w:eastAsia="宋体"/>
+              </w:rPr>
+              <w:t>evidence_baseline_text</w:t>
+            </w:r>
+            <w:proofErr w:type="spellEnd"/>
+            <w:r>
+              <w:rPr>
+                <w:rFonts w:eastAsia="宋体"/>
+              </w:rPr>
+              <w:t>}</w:t>
+            </w:r>
+          </w:p>
+          <w:p>
+            <w:pPr>
+              <w:ind w:firstLineChars="0" w:firstLine="0"/>
+              <w:rPr>
+                <w:rFonts w:eastAsia="宋体"/>
+              </w:rPr>
+            </w:pPr>
+          </w:p>
+          <w:p>
+            <w:pPr>
+              <w:ind w:firstLineChars="0" w:firstLine="0"/>
+              <w:rPr>
+                <w:rFonts w:eastAsia="宋体"/>
+              </w:rPr>
+            </w:pPr>
+            <w:proofErr w:type="gramStart"/>
+            <w:r>
+              <w:rPr>
+                <w:rFonts w:eastAsia="宋体"/>
+              </w:rPr>
+              <w:t>类案样本</w:t>
+            </w:r>
+            <w:proofErr w:type="gramEnd"/>
+            <w:r>
+              <w:rPr>
+                <w:rFonts w:eastAsia="宋体"/>
+              </w:rPr>
+              <w:t>（用于归纳）：</w:t>
+            </w:r>
+          </w:p>
+          <w:p>
+            <w:pPr>
+              <w:ind w:firstLineChars="0" w:firstLine="0"/>
+              <w:rPr>
+                <w:rFonts w:eastAsia="宋体"/>
+              </w:rPr>
+            </w:pPr>
+            <w:r>
+              <w:rPr>
+                <w:rFonts w:eastAsia="宋体"/>
+              </w:rPr>
+              <w:t>{</w:t>
+            </w:r>
+            <w:proofErr w:type="spellStart"/>
+            <w:r>
+              <w:rPr>
+                <w:rFonts w:eastAsia="宋体"/>
+              </w:rPr>
+              <w:t>rows_text</w:t>
+            </w:r>
+            <w:proofErr w:type="spellEnd"/>
+            <w:r>
+              <w:rPr>
+                <w:rFonts w:eastAsia="宋体"/>
+              </w:rPr>
+              <w:t>}</w:t>
+            </w:r>
+          </w:p>
+          <w:p>
+            <w:pPr>
+              <w:ind w:firstLineChars="0" w:firstLine="0"/>
+              <w:rPr>
+                <w:rFonts w:eastAsia="宋体"/>
+              </w:rPr>
+            </w:pPr>
+          </w:p>
+          <w:p>
+            <w:pPr>
+              <w:ind w:firstLineChars="0" w:firstLine="0"/>
+              <w:rPr>
+                <w:rFonts w:eastAsia="宋体"/>
+              </w:rPr>
+            </w:pPr>
+            <w:r>
+              <w:rPr>
+                <w:rFonts w:eastAsia="宋体"/>
+              </w:rPr>
+              <w:t>结构定义如下：</w:t>
+            </w:r>
+          </w:p>
+          <w:p>
+            <w:pPr>
+              <w:ind w:firstLineChars="0" w:firstLine="0"/>
+              <w:rPr>
+                <w:rFonts w:eastAsia="宋体"/>
+              </w:rPr>
+            </w:pPr>
+            <w:r>
+              <w:rPr>
+                <w:rFonts w:eastAsia="宋体"/>
+              </w:rPr>
+              <w:t>{</w:t>
+            </w:r>
+            <w:proofErr w:type="spellStart"/>
+            <w:r>
+              <w:rPr>
+                <w:rFonts w:eastAsia="宋体"/>
+              </w:rPr>
+              <w:t>schema_text</w:t>
+            </w:r>
+            <w:proofErr w:type="spellEnd"/>
+            <w:r>
+              <w:rPr>
+                <w:rFonts w:eastAsia="宋体"/>
+              </w:rPr>
+              <w:t>}</w:t>
+            </w:r>
+          </w:p>
+        </w:tc>
+      </w:tr>
+    </w:tbl>
+    <w:p>
+      <w:pPr>
+        <w:ind w:firstLineChars="0" w:firstLine="0"/>
+        <w:rPr>
+          <w:rFonts w:eastAsia="宋体"/>
+        </w:rPr>
+      </w:pPr>
+    </w:p>
+    <w:p>
+      <w:pPr>
+        <w:ind w:firstLineChars="0" w:firstLine="0"/>
+        <w:rPr>
+          <w:rFonts w:eastAsia="宋体"/>
+        </w:rPr>
+      </w:pPr>
+      <w:proofErr w:type="spellStart"/>
+      <w:r>
+        <w:rPr>
+          <w:rFonts w:eastAsia="宋体"/>
+        </w:rPr>
+        <w:t>opening_human</w:t>
+      </w:r>
+      <w:proofErr w:type="spellEnd"/>
+      <w:r>
+        <w:rPr>
+          <w:rFonts w:eastAsia="宋体"/>
+        </w:rPr>
+        <w:t>：报告开篇</w:t>
+      </w:r>
+    </w:p>
+    <w:tbl>
+      <w:tblPr>
+        <w:tblStyle w:val="ad"/>
+        <w:tblW w:w="0" w:type="auto"/>
+        <w:tblLook w:val="04A0" w:firstRow="1" w:lastRow="0" w:firstColumn="1" w:lastColumn="0" w:noHBand="0" w:noVBand="1"/>
+      </w:tblPr>
+      <w:tblGrid>
+        <w:gridCol w:w="9016"/>
+      </w:tblGrid>
+      <w:tr>
+        <w:tc>
+          <w:tcPr>
+            <w:tcW w:w="9016" w:type="dxa"/>
+          </w:tcPr>
+          <w:p>
+            <w:pPr>
+              <w:ind w:firstLineChars="0" w:firstLine="0"/>
+              <w:rPr>
+                <w:rFonts w:eastAsia="宋体"/>
+              </w:rPr>
+            </w:pPr>
+            <w:r>
+              <w:rPr>
+                <w:rFonts w:eastAsia="宋体"/>
+              </w:rPr>
+              <w:t>本案检索主题：</w:t>
+            </w:r>
+            <w:r>
+              <w:rPr>
+                <w:rFonts w:eastAsia="宋体"/>
+              </w:rPr>
+              <w:t>{query}</w:t>
+            </w:r>
+          </w:p>
+          <w:p>
+            <w:pPr>
+              <w:ind w:firstLineChars="0" w:firstLine="0"/>
+              <w:rPr>
+                <w:rFonts w:eastAsia="宋体"/>
+              </w:rPr>
+            </w:pPr>
+            <w:r>
+              <w:rPr>
+                <w:rFonts w:eastAsia="宋体"/>
+              </w:rPr>
+              <w:t>请撰写报告开篇，要求严格遵守：</w:t>
+            </w:r>
+          </w:p>
+          <w:p>
+            <w:pPr>
+              <w:ind w:firstLineChars="0" w:firstLine="0"/>
+              <w:rPr>
+                <w:rFonts w:eastAsia="宋体"/>
+              </w:rPr>
+            </w:pPr>
+            <w:r>
+              <w:rPr>
+                <w:rFonts w:eastAsia="宋体"/>
+              </w:rPr>
+              <w:t xml:space="preserve">1) </w:t>
+            </w:r>
+            <w:r>
+              <w:rPr>
+                <w:rFonts w:eastAsia="宋体"/>
+              </w:rPr>
+              <w:t>开篇必须旗帜鲜明亮明观点：待论证核心争议问题</w:t>
+            </w:r>
+            <w:r>
+              <w:rPr>
+                <w:rFonts w:eastAsia="宋体"/>
+              </w:rPr>
+              <w:t xml:space="preserve"> + </w:t>
+            </w:r>
+            <w:r>
+              <w:rPr>
+                <w:rFonts w:eastAsia="宋体"/>
+              </w:rPr>
+              <w:t>本方明确法律结论。</w:t>
+            </w:r>
+          </w:p>
+          <w:p>
+            <w:pPr>
+              <w:ind w:firstLineChars="0" w:firstLine="0"/>
+              <w:rPr>
+                <w:rFonts w:eastAsia="宋体"/>
+              </w:rPr>
+            </w:pPr>
+            <w:r>
+              <w:rPr>
+                <w:rFonts w:eastAsia="宋体"/>
+              </w:rPr>
+              <w:t xml:space="preserve">2) </w:t>
+            </w:r>
+            <w:r>
+              <w:rPr>
+                <w:rFonts w:eastAsia="宋体"/>
+              </w:rPr>
+              <w:t>不得只写</w:t>
+            </w:r>
+            <w:r>
+              <w:rPr>
+                <w:rFonts w:eastAsia="宋体"/>
+              </w:rPr>
+              <w:t>“</w:t>
+            </w:r>
+            <w:r>
+              <w:rPr>
+                <w:rFonts w:eastAsia="宋体"/>
+              </w:rPr>
+              <w:t>提交报告供参考</w:t>
+            </w:r>
+            <w:r>
+              <w:rPr>
+                <w:rFonts w:eastAsia="宋体"/>
+              </w:rPr>
+              <w:t>”</w:t>
+            </w:r>
+            <w:r>
+              <w:rPr>
+                <w:rFonts w:eastAsia="宋体"/>
+              </w:rPr>
+              <w:t>，必须直接回应</w:t>
+            </w:r>
+            <w:r>
+              <w:rPr>
+                <w:rFonts w:eastAsia="宋体"/>
+              </w:rPr>
+              <w:t>“</w:t>
+            </w:r>
+            <w:r>
+              <w:rPr>
+                <w:rFonts w:eastAsia="宋体"/>
+              </w:rPr>
+              <w:t>要解决什么问题、实现什么法律效果</w:t>
+            </w:r>
+            <w:r>
+              <w:rPr>
+                <w:rFonts w:eastAsia="宋体"/>
+              </w:rPr>
+              <w:t>”</w:t>
+            </w:r>
+            <w:r>
+              <w:rPr>
+                <w:rFonts w:eastAsia="宋体"/>
+              </w:rPr>
+              <w:t>。</w:t>
+            </w:r>
+          </w:p>
+          <w:p>
+            <w:pPr>
+              <w:ind w:firstLineChars="0" w:firstLine="0"/>
+              <w:rPr>
+                <w:rFonts w:eastAsia="宋体"/>
+              </w:rPr>
+            </w:pPr>
+            <w:r>
+              <w:rPr>
+                <w:rFonts w:eastAsia="宋体"/>
+              </w:rPr>
+              <w:t xml:space="preserve">3) </w:t>
+            </w:r>
+            <w:r>
+              <w:rPr>
+                <w:rFonts w:eastAsia="宋体"/>
+              </w:rPr>
+              <w:t>文风正式、法庭提交场景可直接使用。</w:t>
+            </w:r>
+          </w:p>
+          <w:p>
+            <w:pPr>
+              <w:ind w:firstLineChars="0" w:firstLine="0"/>
+              <w:rPr>
+                <w:rFonts w:eastAsia="宋体"/>
+              </w:rPr>
+            </w:pPr>
+            <w:r>
+              <w:rPr>
+                <w:rFonts w:eastAsia="宋体"/>
+              </w:rPr>
+              <w:t xml:space="preserve">4) </w:t>
+            </w:r>
+            <w:r>
+              <w:rPr>
+                <w:rFonts w:eastAsia="宋体"/>
+              </w:rPr>
+              <w:t>开篇亮明观点段中必须出现</w:t>
+            </w:r>
+            <w:r>
+              <w:rPr>
+                <w:rFonts w:eastAsia="宋体"/>
+              </w:rPr>
+              <w:t>“</w:t>
+            </w:r>
+            <w:r>
+              <w:rPr>
+                <w:rFonts w:eastAsia="宋体"/>
+              </w:rPr>
+              <w:t>检索结果显示，生效裁判均一致认为</w:t>
+            </w:r>
+            <w:r>
+              <w:rPr>
+                <w:rFonts w:eastAsia="宋体"/>
+              </w:rPr>
+              <w:t>”</w:t>
+            </w:r>
+            <w:r>
+              <w:rPr>
+                <w:rFonts w:eastAsia="宋体"/>
+              </w:rPr>
+              <w:t>。</w:t>
+            </w:r>
+          </w:p>
+          <w:p>
+            <w:pPr>
+              <w:ind w:firstLineChars="0" w:firstLine="0"/>
+              <w:rPr>
+                <w:rFonts w:eastAsia="宋体"/>
+              </w:rPr>
+            </w:pPr>
+            <w:proofErr w:type="gramStart"/>
+            <w:r>
+              <w:rPr>
+                <w:rFonts w:eastAsia="宋体"/>
+              </w:rPr>
+              <w:t>类案样本</w:t>
+            </w:r>
+            <w:proofErr w:type="gramEnd"/>
+            <w:r>
+              <w:rPr>
+                <w:rFonts w:eastAsia="宋体"/>
+              </w:rPr>
+              <w:t>（用于归纳）：</w:t>
+            </w:r>
+          </w:p>
+          <w:p>
+            <w:pPr>
+              <w:ind w:firstLineChars="0" w:firstLine="0"/>
+              <w:rPr>
+                <w:rFonts w:eastAsia="宋体"/>
+              </w:rPr>
+            </w:pPr>
+            <w:r>
+              <w:rPr>
+                <w:rFonts w:eastAsia="宋体"/>
+              </w:rPr>
+              <w:t>{</w:t>
+            </w:r>
+            <w:proofErr w:type="spellStart"/>
+            <w:r>
+              <w:rPr>
+                <w:rFonts w:eastAsia="宋体"/>
+              </w:rPr>
+              <w:t>rows_text</w:t>
+            </w:r>
+            <w:proofErr w:type="spellEnd"/>
+            <w:r>
+              <w:rPr>
+                <w:rFonts w:eastAsia="宋体"/>
+              </w:rPr>
+              <w:t>}</w:t>
+            </w:r>
+          </w:p>
+          <w:p>
+            <w:pPr>
+              <w:ind w:firstLineChars="0" w:firstLine="0"/>
+              <w:rPr>
+                <w:rFonts w:eastAsia="宋体"/>
+              </w:rPr>
+            </w:pPr>
+            <w:r>
+              <w:rPr>
+                <w:rFonts w:eastAsia="宋体"/>
+              </w:rPr>
+              <w:t>结构定义如下：</w:t>
+            </w:r>
+          </w:p>
+          <w:p>
+            <w:pPr>
+              <w:ind w:firstLineChars="0" w:firstLine="0"/>
+              <w:rPr>
+                <w:rFonts w:eastAsia="宋体"/>
+              </w:rPr>
+            </w:pPr>
+            <w:r>
+              <w:rPr>
+                <w:rFonts w:eastAsia="宋体"/>
+              </w:rPr>
+              <w:t>{</w:t>
+            </w:r>
+            <w:proofErr w:type="spellStart"/>
+            <w:r>
+              <w:rPr>
+                <w:rFonts w:eastAsia="宋体"/>
+              </w:rPr>
+              <w:t>schema_text</w:t>
+            </w:r>
+            <w:proofErr w:type="spellEnd"/>
+            <w:r>
+              <w:rPr>
+                <w:rFonts w:eastAsia="宋体"/>
+              </w:rPr>
+              <w:t>}</w:t>
+            </w:r>
+          </w:p>
+        </w:tc>
+      </w:tr>
+    </w:tbl>
+    <w:p>
+      <w:pPr>
+        <w:ind w:firstLineChars="0" w:firstLine="0"/>
+        <w:rPr>
+          <w:rFonts w:eastAsia="宋体"/>
+        </w:rPr>
+      </w:pPr>
+    </w:p>
+    <w:p>
+      <w:pPr>
+        <w:ind w:firstLineChars="0" w:firstLine="0"/>
+        <w:rPr>
+          <w:rFonts w:eastAsia="宋体"/>
+        </w:rPr>
+      </w:pPr>
+      <w:proofErr w:type="spellStart"/>
+      <w:r>
+        <w:rPr>
+          <w:rFonts w:eastAsia="宋体"/>
+        </w:rPr>
+        <w:t>attachment_selector_human</w:t>
+      </w:r>
+      <w:proofErr w:type="spellEnd"/>
+      <w:r>
+        <w:rPr>
+          <w:rFonts w:eastAsia="宋体"/>
+        </w:rPr>
+        <w:t>：附件</w:t>
+      </w:r>
+    </w:p>
+    <w:tbl>
+      <w:tblPr>
+        <w:tblStyle w:val="ad"/>
+        <w:tblW w:w="0" w:type="auto"/>
+        <w:tblLook w:val="04A0" w:firstRow="1" w:lastRow="0" w:firstColumn="1" w:lastColumn="0" w:noHBand="0" w:noVBand="1"/>
+      </w:tblPr>
+      <w:tblGrid>
+        <w:gridCol w:w="9016"/>
+      </w:tblGrid>
+      <w:tr>
+        <w:tc>
+          <w:tcPr>
+            <w:tcW w:w="9016" w:type="dxa"/>
+          </w:tcPr>
+          <w:p>
+            <w:pPr>
+              <w:ind w:firstLineChars="0" w:firstLine="0"/>
+              <w:rPr>
+                <w:rFonts w:eastAsia="宋体"/>
+              </w:rPr>
+            </w:pPr>
+            <w:r>
+              <w:rPr>
+                <w:rFonts w:eastAsia="宋体"/>
+              </w:rPr>
+              <w:t>本案检索主题：</w:t>
+            </w:r>
+            <w:r>
+              <w:rPr>
+                <w:rFonts w:eastAsia="宋体"/>
+              </w:rPr>
+              <w:t>{query}</w:t>
+            </w:r>
+          </w:p>
+          <w:p>
+            <w:pPr>
+              <w:ind w:firstLineChars="0" w:firstLine="0"/>
+              <w:rPr>
+                <w:rFonts w:eastAsia="宋体"/>
+              </w:rPr>
+            </w:pPr>
+            <w:r>
+              <w:rPr>
+                <w:rFonts w:eastAsia="宋体"/>
+              </w:rPr>
+              <w:t>请从候选案例中筛选</w:t>
+            </w:r>
+            <w:r>
+              <w:rPr>
+                <w:rFonts w:eastAsia="宋体"/>
+              </w:rPr>
+              <w:t>6-7</w:t>
+            </w:r>
+            <w:r>
+              <w:rPr>
+                <w:rFonts w:eastAsia="宋体"/>
+              </w:rPr>
+              <w:t>个用于报告第六部分附件，筛选标准：</w:t>
+            </w:r>
+          </w:p>
+          <w:p>
+            <w:pPr>
+              <w:ind w:firstLineChars="0" w:firstLine="0"/>
+              <w:rPr>
+                <w:rFonts w:eastAsia="宋体"/>
+              </w:rPr>
+            </w:pPr>
+            <w:r>
+              <w:rPr>
+                <w:rFonts w:eastAsia="宋体"/>
+              </w:rPr>
+              <w:t xml:space="preserve">1) </w:t>
+            </w:r>
+            <w:r>
+              <w:rPr>
+                <w:rFonts w:eastAsia="宋体"/>
+              </w:rPr>
+              <w:t>优先选择高级人民法院或最高人民法院案例；</w:t>
+            </w:r>
+          </w:p>
+          <w:p>
+            <w:pPr>
+              <w:ind w:firstLineChars="0" w:firstLine="0"/>
+              <w:rPr>
+                <w:rFonts w:eastAsia="宋体"/>
+              </w:rPr>
+            </w:pPr>
+            <w:r>
+              <w:rPr>
+                <w:rFonts w:eastAsia="宋体"/>
+              </w:rPr>
+              <w:t xml:space="preserve">2) </w:t>
+            </w:r>
+            <w:r>
+              <w:rPr>
+                <w:rFonts w:eastAsia="宋体"/>
+              </w:rPr>
+              <w:t>其次可选择中级人民法院案例，但必须与本案核心事实和争点高度相似；</w:t>
+            </w:r>
+          </w:p>
+          <w:p>
+            <w:pPr>
+              <w:ind w:firstLineChars="0" w:firstLine="0"/>
+              <w:rPr>
+                <w:rFonts w:eastAsia="宋体"/>
+              </w:rPr>
+            </w:pPr>
+            <w:r>
+              <w:rPr>
+                <w:rFonts w:eastAsia="宋体"/>
+              </w:rPr>
+              <w:t xml:space="preserve">3) </w:t>
+            </w:r>
+            <w:r>
+              <w:rPr>
+                <w:rFonts w:eastAsia="宋体"/>
+              </w:rPr>
+              <w:t>不选基层法院且相关性弱的案例；</w:t>
+            </w:r>
+          </w:p>
+          <w:p>
+            <w:pPr>
+              <w:ind w:firstLineChars="0" w:firstLine="0"/>
+              <w:rPr>
+                <w:rFonts w:eastAsia="宋体"/>
+              </w:rPr>
+            </w:pPr>
+            <w:r>
+              <w:rPr>
+                <w:rFonts w:eastAsia="宋体"/>
+              </w:rPr>
+              <w:t xml:space="preserve">4) </w:t>
+            </w:r>
+            <w:r>
+              <w:rPr>
+                <w:rFonts w:eastAsia="宋体"/>
+              </w:rPr>
+              <w:t>数量上优先选择</w:t>
+            </w:r>
+            <w:r>
+              <w:rPr>
+                <w:rFonts w:eastAsia="宋体"/>
+              </w:rPr>
+              <w:t>6-7</w:t>
+            </w:r>
+            <w:r>
+              <w:rPr>
+                <w:rFonts w:eastAsia="宋体"/>
+              </w:rPr>
+              <w:t>个，但并非硬性要求，应以质量优先；</w:t>
+            </w:r>
+          </w:p>
+          <w:p>
+            <w:pPr>
+              <w:ind w:firstLineChars="0" w:firstLine="0"/>
+              <w:rPr>
+                <w:rFonts w:eastAsia="宋体"/>
+              </w:rPr>
+            </w:pPr>
+            <w:r>
+              <w:rPr>
+                <w:rFonts w:eastAsia="宋体"/>
+              </w:rPr>
+              <w:t xml:space="preserve">5) </w:t>
+            </w:r>
+            <w:r>
+              <w:rPr>
+                <w:rFonts w:eastAsia="宋体"/>
+              </w:rPr>
+              <w:t>输出仅包含</w:t>
+            </w:r>
+            <w:r>
+              <w:rPr>
+                <w:rFonts w:eastAsia="宋体"/>
+              </w:rPr>
+              <w:t>“</w:t>
+            </w:r>
+            <w:r>
+              <w:rPr>
+                <w:rFonts w:eastAsia="宋体"/>
+              </w:rPr>
+              <w:t>选中序号</w:t>
+            </w:r>
+            <w:r>
+              <w:rPr>
+                <w:rFonts w:eastAsia="宋体"/>
+              </w:rPr>
+              <w:t>”</w:t>
+            </w:r>
+            <w:r>
+              <w:rPr>
+                <w:rFonts w:eastAsia="宋体"/>
+              </w:rPr>
+              <w:t>数组。</w:t>
+            </w:r>
+          </w:p>
+          <w:p>
+            <w:pPr>
+              <w:ind w:firstLineChars="0" w:firstLine="0"/>
+              <w:rPr>
+                <w:rFonts w:eastAsia="宋体"/>
+              </w:rPr>
+            </w:pPr>
+            <w:r>
+              <w:rPr>
+                <w:rFonts w:eastAsia="宋体"/>
+              </w:rPr>
+              <w:t>候选案例如下：</w:t>
+            </w:r>
+          </w:p>
+          <w:p>
+            <w:pPr>
+              <w:ind w:firstLineChars="0" w:firstLine="0"/>
+              <w:rPr>
+                <w:rFonts w:eastAsia="宋体"/>
+              </w:rPr>
+            </w:pPr>
+            <w:r>
+              <w:rPr>
+                <w:rFonts w:eastAsia="宋体"/>
+              </w:rPr>
+              <w:t>{</w:t>
+            </w:r>
+            <w:proofErr w:type="spellStart"/>
+            <w:r>
+              <w:rPr>
+                <w:rFonts w:eastAsia="宋体"/>
+              </w:rPr>
+              <w:t>candidates_text</w:t>
+            </w:r>
+            <w:proofErr w:type="spellEnd"/>
+            <w:r>
+              <w:rPr>
+                <w:rFonts w:eastAsia="宋体"/>
+              </w:rPr>
+              <w:t>}</w:t>
+            </w:r>
+          </w:p>
+          <w:p>
+            <w:pPr>
+              <w:ind w:firstLineChars="0" w:firstLine="0"/>
+              <w:rPr>
+                <w:rFonts w:eastAsia="宋体"/>
+              </w:rPr>
+            </w:pPr>
+            <w:r>
+              <w:rPr>
+                <w:rFonts w:eastAsia="宋体"/>
+              </w:rPr>
+              <w:t>结构定义如下：</w:t>
+            </w:r>
+          </w:p>
+          <w:p>
+            <w:pPr>
+              <w:ind w:firstLineChars="0" w:firstLine="0"/>
+              <w:rPr>
+                <w:rFonts w:eastAsia="宋体"/>
+              </w:rPr>
+            </w:pPr>
+            <w:r>
+              <w:rPr>
+                <w:rFonts w:eastAsia="宋体"/>
+              </w:rPr>
+              <w:t>{</w:t>
+            </w:r>
+            <w:proofErr w:type="spellStart"/>
+            <w:r>
+              <w:rPr>
+                <w:rFonts w:eastAsia="宋体"/>
+              </w:rPr>
+              <w:t>schema_text</w:t>
+            </w:r>
+            <w:proofErr w:type="spellEnd"/>
+            <w:r>
+              <w:rPr>
+                <w:rFonts w:eastAsia="宋体"/>
+              </w:rPr>
+              <w:t>}</w:t>
+            </w:r>
+          </w:p>
+        </w:tc>
+      </w:tr>
+    </w:tbl>
+    <w:p>
+      <w:pPr>
+        <w:ind w:firstLineChars="0" w:firstLine="0"/>
+        <w:rPr>
+          <w:rFonts w:eastAsia="宋体"/>
+        </w:rPr>
+      </w:pPr>
     </w:p>
     <w:sectPr>
       <w:headerReference w:type="even" r:id="rId7"/>
@@ -3582,6 +7492,182 @@
     </w:lvl>
   </w:abstractNum>
   <w:abstractNum w:abstractNumId="1" w15:restartNumberingAfterBreak="0">
+    <w:nsid w:val="42BB438B"/>
+    <w:multiLevelType w:val="hybridMultilevel"/>
+    <w:tmpl w:val="A3EACD40"/>
+    <w:lvl w:ilvl="0" w:tplc="C93A35E8">
+      <w:start w:val="1"/>
+      <w:numFmt w:val="decimal"/>
+      <w:lvlText w:val="%1."/>
+      <w:lvlJc w:val="left"/>
+      <w:pPr>
+        <w:ind w:left="440" w:hanging="440"/>
+      </w:pPr>
+      <w:rPr>
+        <w:b w:val="0"/>
+        <w:bCs w:val="0"/>
+      </w:rPr>
+    </w:lvl>
+    <w:lvl w:ilvl="1" w:tplc="04090019" w:tentative="1">
+      <w:start w:val="1"/>
+      <w:numFmt w:val="lowerLetter"/>
+      <w:lvlText w:val="%2)"/>
+      <w:lvlJc w:val="left"/>
+      <w:pPr>
+        <w:ind w:left="880" w:hanging="440"/>
+      </w:pPr>
+    </w:lvl>
+    <w:lvl w:ilvl="2" w:tplc="0409001B" w:tentative="1">
+      <w:start w:val="1"/>
+      <w:numFmt w:val="lowerRoman"/>
+      <w:lvlText w:val="%3."/>
+      <w:lvlJc w:val="right"/>
+      <w:pPr>
+        <w:ind w:left="1320" w:hanging="440"/>
+      </w:pPr>
+    </w:lvl>
+    <w:lvl w:ilvl="3" w:tplc="0409000F" w:tentative="1">
+      <w:start w:val="1"/>
+      <w:numFmt w:val="decimal"/>
+      <w:lvlText w:val="%4."/>
+      <w:lvlJc w:val="left"/>
+      <w:pPr>
+        <w:ind w:left="1760" w:hanging="440"/>
+      </w:pPr>
+    </w:lvl>
+    <w:lvl w:ilvl="4" w:tplc="04090019" w:tentative="1">
+      <w:start w:val="1"/>
+      <w:numFmt w:val="lowerLetter"/>
+      <w:lvlText w:val="%5)"/>
+      <w:lvlJc w:val="left"/>
+      <w:pPr>
+        <w:ind w:left="2200" w:hanging="440"/>
+      </w:pPr>
+    </w:lvl>
+    <w:lvl w:ilvl="5" w:tplc="0409001B" w:tentative="1">
+      <w:start w:val="1"/>
+      <w:numFmt w:val="lowerRoman"/>
+      <w:lvlText w:val="%6."/>
+      <w:lvlJc w:val="right"/>
+      <w:pPr>
+        <w:ind w:left="2640" w:hanging="440"/>
+      </w:pPr>
+    </w:lvl>
+    <w:lvl w:ilvl="6" w:tplc="0409000F" w:tentative="1">
+      <w:start w:val="1"/>
+      <w:numFmt w:val="decimal"/>
+      <w:lvlText w:val="%7."/>
+      <w:lvlJc w:val="left"/>
+      <w:pPr>
+        <w:ind w:left="3080" w:hanging="440"/>
+      </w:pPr>
+    </w:lvl>
+    <w:lvl w:ilvl="7" w:tplc="04090019" w:tentative="1">
+      <w:start w:val="1"/>
+      <w:numFmt w:val="lowerLetter"/>
+      <w:lvlText w:val="%8)"/>
+      <w:lvlJc w:val="left"/>
+      <w:pPr>
+        <w:ind w:left="3520" w:hanging="440"/>
+      </w:pPr>
+    </w:lvl>
+    <w:lvl w:ilvl="8" w:tplc="0409001B" w:tentative="1">
+      <w:start w:val="1"/>
+      <w:numFmt w:val="lowerRoman"/>
+      <w:lvlText w:val="%9."/>
+      <w:lvlJc w:val="right"/>
+      <w:pPr>
+        <w:ind w:left="3960" w:hanging="440"/>
+      </w:pPr>
+    </w:lvl>
+  </w:abstractNum>
+  <w:abstractNum w:abstractNumId="2" w15:restartNumberingAfterBreak="0">
+    <w:nsid w:val="4AA15880"/>
+    <w:multiLevelType w:val="hybridMultilevel"/>
+    <w:tmpl w:val="D90EA832"/>
+    <w:lvl w:ilvl="0" w:tplc="0409000F">
+      <w:start w:val="1"/>
+      <w:numFmt w:val="decimal"/>
+      <w:lvlText w:val="%1."/>
+      <w:lvlJc w:val="left"/>
+      <w:pPr>
+        <w:ind w:left="440" w:hanging="440"/>
+      </w:pPr>
+    </w:lvl>
+    <w:lvl w:ilvl="1" w:tplc="04090019" w:tentative="1">
+      <w:start w:val="1"/>
+      <w:numFmt w:val="lowerLetter"/>
+      <w:lvlText w:val="%2)"/>
+      <w:lvlJc w:val="left"/>
+      <w:pPr>
+        <w:ind w:left="880" w:hanging="440"/>
+      </w:pPr>
+    </w:lvl>
+    <w:lvl w:ilvl="2" w:tplc="0409001B" w:tentative="1">
+      <w:start w:val="1"/>
+      <w:numFmt w:val="lowerRoman"/>
+      <w:lvlText w:val="%3."/>
+      <w:lvlJc w:val="right"/>
+      <w:pPr>
+        <w:ind w:left="1320" w:hanging="440"/>
+      </w:pPr>
+    </w:lvl>
+    <w:lvl w:ilvl="3" w:tplc="0409000F" w:tentative="1">
+      <w:start w:val="1"/>
+      <w:numFmt w:val="decimal"/>
+      <w:lvlText w:val="%4."/>
+      <w:lvlJc w:val="left"/>
+      <w:pPr>
+        <w:ind w:left="1760" w:hanging="440"/>
+      </w:pPr>
+    </w:lvl>
+    <w:lvl w:ilvl="4" w:tplc="04090019" w:tentative="1">
+      <w:start w:val="1"/>
+      <w:numFmt w:val="lowerLetter"/>
+      <w:lvlText w:val="%5)"/>
+      <w:lvlJc w:val="left"/>
+      <w:pPr>
+        <w:ind w:left="2200" w:hanging="440"/>
+      </w:pPr>
+    </w:lvl>
+    <w:lvl w:ilvl="5" w:tplc="0409001B" w:tentative="1">
+      <w:start w:val="1"/>
+      <w:numFmt w:val="lowerRoman"/>
+      <w:lvlText w:val="%6."/>
+      <w:lvlJc w:val="right"/>
+      <w:pPr>
+        <w:ind w:left="2640" w:hanging="440"/>
+      </w:pPr>
+    </w:lvl>
+    <w:lvl w:ilvl="6" w:tplc="0409000F" w:tentative="1">
+      <w:start w:val="1"/>
+      <w:numFmt w:val="decimal"/>
+      <w:lvlText w:val="%7."/>
+      <w:lvlJc w:val="left"/>
+      <w:pPr>
+        <w:ind w:left="3080" w:hanging="440"/>
+      </w:pPr>
+    </w:lvl>
+    <w:lvl w:ilvl="7" w:tplc="04090019" w:tentative="1">
+      <w:start w:val="1"/>
+      <w:numFmt w:val="lowerLetter"/>
+      <w:lvlText w:val="%8)"/>
+      <w:lvlJc w:val="left"/>
+      <w:pPr>
+        <w:ind w:left="3520" w:hanging="440"/>
+      </w:pPr>
+    </w:lvl>
+    <w:lvl w:ilvl="8" w:tplc="0409001B" w:tentative="1">
+      <w:start w:val="1"/>
+      <w:numFmt w:val="lowerRoman"/>
+      <w:lvlText w:val="%9."/>
+      <w:lvlJc w:val="right"/>
+      <w:pPr>
+        <w:ind w:left="3960" w:hanging="440"/>
+      </w:pPr>
+    </w:lvl>
+  </w:abstractNum>
+  <w:abstractNum w:abstractNumId="3" w15:restartNumberingAfterBreak="0">
     <w:nsid w:val="73902697"/>
     <w:multiLevelType w:val="hybridMultilevel"/>
     <w:tmpl w:val="5F7C6CAE"/>
@@ -3668,7 +7754,7 @@
     </w:lvl>
   </w:abstractNum>
   <w:num w:numId="1" w16cid:durableId="1002975522">
-    <w:abstractNumId w:val="1"/>
+    <w:abstractNumId w:val="3"/>
     <w:lvlOverride w:ilvl="0">
       <w:startOverride w:val="1"/>
     </w:lvlOverride>
@@ -3678,6 +7764,12 @@
     <w:lvlOverride w:ilvl="0">
       <w:startOverride w:val="1"/>
     </w:lvlOverride>
+  </w:num>
+  <w:num w:numId="3" w16cid:durableId="1495025509">
+    <w:abstractNumId w:val="1"/>
+  </w:num>
+  <w:num w:numId="4" w16cid:durableId="85197241">
+    <w:abstractNumId w:val="2"/>
   </w:num>
 </w:numbering>
 </file>
@@ -4132,7 +8224,6 @@
   <w:style w:type="paragraph" w:styleId="4">
     <w:name w:val="heading 4"/>
     <w:uiPriority w:val="9"/>
-    <w:semiHidden/>
     <w:unhideWhenUsed/>
     <w:qFormat/>
     <w:pPr>
@@ -4181,7 +8272,6 @@
   <w:style w:type="character" w:default="1" w:styleId="a0">
     <w:name w:val="Default Paragraph Font"/>
     <w:uiPriority w:val="1"/>
-    <w:semiHidden/>
     <w:unhideWhenUsed/>
   </w:style>
   <w:style w:type="table" w:default="1" w:styleId="a1">
@@ -4326,6 +8416,22 @@
       <w:sz w:val="18"/>
       <w:szCs w:val="18"/>
     </w:rPr>
+  </w:style>
+  <w:style w:type="table" w:styleId="ad">
+    <w:name w:val="Table Grid"/>
+    <w:basedOn w:val="a1"/>
+    <w:uiPriority w:val="39"/>
+    <w:rsid w:val="002F16B7"/>
+    <w:tblPr>
+      <w:tblBorders>
+        <w:top w:val="single" w:sz="4" w:space="0" w:color="auto"/>
+        <w:left w:val="single" w:sz="4" w:space="0" w:color="auto"/>
+        <w:bottom w:val="single" w:sz="4" w:space="0" w:color="auto"/>
+        <w:right w:val="single" w:sz="4" w:space="0" w:color="auto"/>
+        <w:insideH w:val="single" w:sz="4" w:space="0" w:color="auto"/>
+        <w:insideV w:val="single" w:sz="4" w:space="0" w:color="auto"/>
+      </w:tblBorders>
+    </w:tblPr>
   </w:style>
 </w:styles>
 </file>

</xml_diff>